<commit_message>
Updated files and folders till week 4 task
</commit_message>
<xml_diff>
--- a/DOCUMENTATION_TALENTLINK.docx
+++ b/DOCUMENTATION_TALENTLINK.docx
@@ -1194,15 +1194,25 @@
           <w:bCs/>
         </w:rPr>
         <w:lastRenderedPageBreak/>
-        <w:t>WEEK 3 – TASK</w:t>
-      </w:r>
-      <w:r>
+        <w:t>WEEK 3 – TASK:</w:t>
+      </w:r>
+    </w:p>
+    <w:p>
+      <w:pPr>
+        <w:spacing w:line="360" w:lineRule="auto"/>
         <w:rPr>
           <w:rFonts w:ascii="Times New Roman" w:hAnsi="Times New Roman" w:cs="Times New Roman"/>
           <w:b/>
           <w:bCs/>
         </w:rPr>
-        <w:t>:</w:t>
+      </w:pPr>
+      <w:r>
+        <w:rPr>
+          <w:rFonts w:ascii="Times New Roman" w:hAnsi="Times New Roman" w:cs="Times New Roman"/>
+          <w:b/>
+          <w:bCs/>
+        </w:rPr>
+        <w:t>Date: December 23, 2025</w:t>
       </w:r>
     </w:p>
     <w:p>
@@ -1220,12 +1230,41 @@
           <w:b/>
           <w:bCs/>
         </w:rPr>
-        <w:t>Date: December 23, 2025</w:t>
+        <w:t xml:space="preserve">INTRODUCTION </w:t>
       </w:r>
     </w:p>
     <w:p>
       <w:pPr>
         <w:spacing w:line="360" w:lineRule="auto"/>
+        <w:ind w:firstLine="720"/>
+        <w:rPr>
+          <w:rFonts w:ascii="Times New Roman" w:hAnsi="Times New Roman" w:cs="Times New Roman"/>
+        </w:rPr>
+      </w:pPr>
+      <w:r>
+        <w:rPr>
+          <w:rFonts w:ascii="Times New Roman" w:hAnsi="Times New Roman" w:cs="Times New Roman"/>
+        </w:rPr>
+        <w:t xml:space="preserve">In Week 3, we improved </w:t>
+      </w:r>
+      <w:proofErr w:type="spellStart"/>
+      <w:r>
+        <w:rPr>
+          <w:rFonts w:ascii="Times New Roman" w:hAnsi="Times New Roman" w:cs="Times New Roman"/>
+        </w:rPr>
+        <w:t>TalentLink</w:t>
+      </w:r>
+      <w:proofErr w:type="spellEnd"/>
+      <w:r>
+        <w:rPr>
+          <w:rFonts w:ascii="Times New Roman" w:hAnsi="Times New Roman" w:cs="Times New Roman"/>
+        </w:rPr>
+        <w:t xml:space="preserve"> by adding detailed freelancer profiles, complete project management for clients, and smart search/filter features to better connect freelancers with projects.</w:t>
+      </w:r>
+    </w:p>
+    <w:p>
+      <w:pPr>
+        <w:spacing w:line="360" w:lineRule="auto"/>
         <w:rPr>
           <w:rFonts w:ascii="Times New Roman" w:hAnsi="Times New Roman" w:cs="Times New Roman"/>
           <w:b/>
@@ -1238,70 +1277,7 @@
           <w:b/>
           <w:bCs/>
         </w:rPr>
-        <w:t>I</w:t>
-      </w:r>
-      <w:r>
-        <w:rPr>
-          <w:rFonts w:ascii="Times New Roman" w:hAnsi="Times New Roman" w:cs="Times New Roman"/>
-          <w:b/>
-          <w:bCs/>
-        </w:rPr>
-        <w:t xml:space="preserve">NTRODUCTION </w:t>
-      </w:r>
-    </w:p>
-    <w:p>
-      <w:pPr>
-        <w:spacing w:line="360" w:lineRule="auto"/>
-        <w:ind w:firstLine="720"/>
-        <w:rPr>
-          <w:rFonts w:ascii="Times New Roman" w:hAnsi="Times New Roman" w:cs="Times New Roman"/>
-        </w:rPr>
-      </w:pPr>
-      <w:r>
-        <w:rPr>
-          <w:rFonts w:ascii="Times New Roman" w:hAnsi="Times New Roman" w:cs="Times New Roman"/>
-        </w:rPr>
-        <w:t xml:space="preserve">In Week 3, we improved </w:t>
-      </w:r>
-      <w:proofErr w:type="spellStart"/>
-      <w:r>
-        <w:rPr>
-          <w:rFonts w:ascii="Times New Roman" w:hAnsi="Times New Roman" w:cs="Times New Roman"/>
-        </w:rPr>
-        <w:t>TalentLink</w:t>
-      </w:r>
-      <w:proofErr w:type="spellEnd"/>
-      <w:r>
-        <w:rPr>
-          <w:rFonts w:ascii="Times New Roman" w:hAnsi="Times New Roman" w:cs="Times New Roman"/>
-        </w:rPr>
-        <w:t xml:space="preserve"> by adding detailed freelancer profiles, complete project management for clients, and smart search/filter features to better connect freelancers with projects.</w:t>
-      </w:r>
-    </w:p>
-    <w:p>
-      <w:pPr>
-        <w:spacing w:line="360" w:lineRule="auto"/>
-        <w:rPr>
-          <w:rFonts w:ascii="Times New Roman" w:hAnsi="Times New Roman" w:cs="Times New Roman"/>
-          <w:b/>
-          <w:bCs/>
-        </w:rPr>
-      </w:pPr>
-      <w:r>
-        <w:rPr>
-          <w:rFonts w:ascii="Times New Roman" w:hAnsi="Times New Roman" w:cs="Times New Roman"/>
-          <w:b/>
-          <w:bCs/>
-        </w:rPr>
-        <w:t>T</w:t>
-      </w:r>
-      <w:r>
-        <w:rPr>
-          <w:rFonts w:ascii="Times New Roman" w:hAnsi="Times New Roman" w:cs="Times New Roman"/>
-          <w:b/>
-          <w:bCs/>
-        </w:rPr>
-        <w:t>ASKS COMPLETED</w:t>
+        <w:t>TASKS COMPLETED</w:t>
       </w:r>
     </w:p>
     <w:p>
@@ -1511,15 +1487,7 @@
           <w:b/>
           <w:bCs/>
         </w:rPr>
-        <w:t>C</w:t>
-      </w:r>
-      <w:r>
-        <w:rPr>
-          <w:rFonts w:ascii="Times New Roman" w:hAnsi="Times New Roman" w:cs="Times New Roman"/>
-          <w:b/>
-          <w:bCs/>
-        </w:rPr>
-        <w:t>HALLENGES FACED</w:t>
+        <w:t>CHALLENGES FACED</w:t>
       </w:r>
     </w:p>
     <w:p>
@@ -1597,15 +1565,7 @@
           <w:b/>
           <w:bCs/>
         </w:rPr>
-        <w:t>L</w:t>
-      </w:r>
-      <w:r>
-        <w:rPr>
-          <w:rFonts w:ascii="Times New Roman" w:hAnsi="Times New Roman" w:cs="Times New Roman"/>
-          <w:b/>
-          <w:bCs/>
-        </w:rPr>
-        <w:t>EARNINGS</w:t>
+        <w:t>LEARNINGS</w:t>
       </w:r>
     </w:p>
     <w:p>
@@ -1692,20 +1652,418 @@
           <w:b/>
           <w:bCs/>
         </w:rPr>
-        <w:t>C</w:t>
-      </w:r>
-      <w:r>
+        <w:t>CONCLUSION</w:t>
+      </w:r>
+    </w:p>
+    <w:p>
+      <w:pPr>
+        <w:spacing w:line="360" w:lineRule="auto"/>
+        <w:ind w:firstLine="720"/>
+        <w:rPr>
+          <w:rFonts w:ascii="Times New Roman" w:hAnsi="Times New Roman" w:cs="Times New Roman"/>
+        </w:rPr>
+      </w:pPr>
+      <w:r>
+        <w:rPr>
+          <w:rFonts w:ascii="Times New Roman" w:hAnsi="Times New Roman" w:cs="Times New Roman"/>
+        </w:rPr>
+        <w:t xml:space="preserve">Week 3 delivered core marketplace functionality: freelancers can now showcase their expertise, clients can post and manage projects, and both can find matches efficiently. </w:t>
+      </w:r>
+      <w:proofErr w:type="spellStart"/>
+      <w:r>
+        <w:rPr>
+          <w:rFonts w:ascii="Times New Roman" w:hAnsi="Times New Roman" w:cs="Times New Roman"/>
+        </w:rPr>
+        <w:t>TalentLink</w:t>
+      </w:r>
+      <w:proofErr w:type="spellEnd"/>
+      <w:r>
+        <w:rPr>
+          <w:rFonts w:ascii="Times New Roman" w:hAnsi="Times New Roman" w:cs="Times New Roman"/>
+        </w:rPr>
+        <w:t xml:space="preserve"> is now ready for real-world use and future expansions.</w:t>
+      </w:r>
+    </w:p>
+    <w:p>
+      <w:pPr>
+        <w:spacing w:line="360" w:lineRule="auto"/>
         <w:rPr>
           <w:rFonts w:ascii="Times New Roman" w:hAnsi="Times New Roman" w:cs="Times New Roman"/>
           <w:b/>
           <w:bCs/>
         </w:rPr>
-        <w:t>ONCLUSION</w:t>
+      </w:pPr>
+      <w:r>
+        <w:rPr>
+          <w:rFonts w:ascii="Times New Roman" w:hAnsi="Times New Roman" w:cs="Times New Roman"/>
+          <w:b/>
+          <w:bCs/>
+        </w:rPr>
+        <w:lastRenderedPageBreak/>
+        <w:t>WEEK 4 – TASK</w:t>
+      </w:r>
+      <w:r>
+        <w:rPr>
+          <w:rFonts w:ascii="Times New Roman" w:hAnsi="Times New Roman" w:cs="Times New Roman"/>
+          <w:b/>
+          <w:bCs/>
+        </w:rPr>
+        <w:t>:</w:t>
       </w:r>
     </w:p>
     <w:p>
       <w:pPr>
         <w:spacing w:line="360" w:lineRule="auto"/>
+        <w:rPr>
+          <w:rFonts w:ascii="Times New Roman" w:hAnsi="Times New Roman" w:cs="Times New Roman"/>
+          <w:b/>
+          <w:bCs/>
+        </w:rPr>
+      </w:pPr>
+      <w:r>
+        <w:rPr>
+          <w:rFonts w:ascii="Times New Roman" w:hAnsi="Times New Roman" w:cs="Times New Roman"/>
+          <w:b/>
+          <w:bCs/>
+        </w:rPr>
+        <w:t>Date: December 30, 2025</w:t>
+      </w:r>
+    </w:p>
+    <w:p>
+      <w:pPr>
+        <w:spacing w:line="360" w:lineRule="auto"/>
+        <w:rPr>
+          <w:rFonts w:ascii="Times New Roman" w:hAnsi="Times New Roman" w:cs="Times New Roman"/>
+          <w:b/>
+          <w:bCs/>
+        </w:rPr>
+      </w:pPr>
+      <w:r>
+        <w:rPr>
+          <w:rFonts w:ascii="Times New Roman" w:hAnsi="Times New Roman" w:cs="Times New Roman"/>
+          <w:b/>
+          <w:bCs/>
+        </w:rPr>
+        <w:t>INTRODUCTION</w:t>
+      </w:r>
+    </w:p>
+    <w:p>
+      <w:pPr>
+        <w:spacing w:line="360" w:lineRule="auto"/>
+        <w:rPr>
+          <w:rFonts w:ascii="Times New Roman" w:hAnsi="Times New Roman" w:cs="Times New Roman"/>
+        </w:rPr>
+      </w:pPr>
+      <w:r>
+        <w:rPr>
+          <w:rFonts w:ascii="Times New Roman" w:hAnsi="Times New Roman" w:cs="Times New Roman"/>
+        </w:rPr>
+        <w:t xml:space="preserve">In Week 4, </w:t>
+      </w:r>
+      <w:proofErr w:type="spellStart"/>
+      <w:r>
+        <w:rPr>
+          <w:rFonts w:ascii="Times New Roman" w:hAnsi="Times New Roman" w:cs="Times New Roman"/>
+        </w:rPr>
+        <w:t>TalentLink</w:t>
+      </w:r>
+      <w:proofErr w:type="spellEnd"/>
+      <w:r>
+        <w:rPr>
+          <w:rFonts w:ascii="Times New Roman" w:hAnsi="Times New Roman" w:cs="Times New Roman"/>
+        </w:rPr>
+        <w:t xml:space="preserve"> was enhanced by adding a proposal system that allows freelancers to apply for projects and clients to manage proposals. Basic frontend pages were also developed to support the hiring process.</w:t>
+      </w:r>
+    </w:p>
+    <w:p>
+      <w:pPr>
+        <w:spacing w:line="360" w:lineRule="auto"/>
+        <w:rPr>
+          <w:rFonts w:ascii="Times New Roman" w:hAnsi="Times New Roman" w:cs="Times New Roman"/>
+          <w:b/>
+          <w:bCs/>
+        </w:rPr>
+      </w:pPr>
+      <w:r>
+        <w:rPr>
+          <w:rFonts w:ascii="Times New Roman" w:hAnsi="Times New Roman" w:cs="Times New Roman"/>
+          <w:b/>
+          <w:bCs/>
+        </w:rPr>
+        <w:t>TASKS COMPLETED</w:t>
+      </w:r>
+    </w:p>
+    <w:p>
+      <w:pPr>
+        <w:numPr>
+          <w:ilvl w:val="0"/>
+          <w:numId w:val="41"/>
+        </w:numPr>
+        <w:spacing w:line="360" w:lineRule="auto"/>
+        <w:rPr>
+          <w:rFonts w:ascii="Times New Roman" w:hAnsi="Times New Roman" w:cs="Times New Roman"/>
+        </w:rPr>
+      </w:pPr>
+      <w:r>
+        <w:rPr>
+          <w:rFonts w:ascii="Times New Roman" w:hAnsi="Times New Roman" w:cs="Times New Roman"/>
+        </w:rPr>
+        <w:t>Created Proposal model linked with Project and User</w:t>
+      </w:r>
+    </w:p>
+    <w:p>
+      <w:pPr>
+        <w:numPr>
+          <w:ilvl w:val="0"/>
+          <w:numId w:val="41"/>
+        </w:numPr>
+        <w:spacing w:line="360" w:lineRule="auto"/>
+        <w:rPr>
+          <w:rFonts w:ascii="Times New Roman" w:hAnsi="Times New Roman" w:cs="Times New Roman"/>
+        </w:rPr>
+      </w:pPr>
+      <w:r>
+        <w:rPr>
+          <w:rFonts w:ascii="Times New Roman" w:hAnsi="Times New Roman" w:cs="Times New Roman"/>
+        </w:rPr>
+        <w:t>Enabled freelancers to submit proposals</w:t>
+      </w:r>
+    </w:p>
+    <w:p>
+      <w:pPr>
+        <w:numPr>
+          <w:ilvl w:val="0"/>
+          <w:numId w:val="41"/>
+        </w:numPr>
+        <w:spacing w:line="360" w:lineRule="auto"/>
+        <w:rPr>
+          <w:rFonts w:ascii="Times New Roman" w:hAnsi="Times New Roman" w:cs="Times New Roman"/>
+        </w:rPr>
+      </w:pPr>
+      <w:r>
+        <w:rPr>
+          <w:rFonts w:ascii="Times New Roman" w:hAnsi="Times New Roman" w:cs="Times New Roman"/>
+        </w:rPr>
+        <w:t>Allowed clients to view, accept, or reject proposals</w:t>
+      </w:r>
+    </w:p>
+    <w:p>
+      <w:pPr>
+        <w:numPr>
+          <w:ilvl w:val="0"/>
+          <w:numId w:val="41"/>
+        </w:numPr>
+        <w:spacing w:line="360" w:lineRule="auto"/>
+        <w:rPr>
+          <w:rFonts w:ascii="Times New Roman" w:hAnsi="Times New Roman" w:cs="Times New Roman"/>
+        </w:rPr>
+      </w:pPr>
+      <w:r>
+        <w:rPr>
+          <w:rFonts w:ascii="Times New Roman" w:hAnsi="Times New Roman" w:cs="Times New Roman"/>
+        </w:rPr>
+        <w:t>Implemented role-based access control</w:t>
+      </w:r>
+    </w:p>
+    <w:p>
+      <w:pPr>
+        <w:numPr>
+          <w:ilvl w:val="0"/>
+          <w:numId w:val="41"/>
+        </w:numPr>
+        <w:spacing w:line="360" w:lineRule="auto"/>
+        <w:rPr>
+          <w:rFonts w:ascii="Times New Roman" w:hAnsi="Times New Roman" w:cs="Times New Roman"/>
+        </w:rPr>
+      </w:pPr>
+      <w:r>
+        <w:rPr>
+          <w:rFonts w:ascii="Times New Roman" w:hAnsi="Times New Roman" w:cs="Times New Roman"/>
+        </w:rPr>
+        <w:t>Developed project feed and project details pages</w:t>
+      </w:r>
+    </w:p>
+    <w:p>
+      <w:pPr>
+        <w:spacing w:line="360" w:lineRule="auto"/>
+        <w:rPr>
+          <w:rFonts w:ascii="Times New Roman" w:hAnsi="Times New Roman" w:cs="Times New Roman"/>
+          <w:b/>
+          <w:bCs/>
+        </w:rPr>
+      </w:pPr>
+      <w:r>
+        <w:rPr>
+          <w:rFonts w:ascii="Times New Roman" w:hAnsi="Times New Roman" w:cs="Times New Roman"/>
+          <w:b/>
+          <w:bCs/>
+        </w:rPr>
+        <w:t>CHALLENGES FACED</w:t>
+      </w:r>
+    </w:p>
+    <w:p>
+      <w:pPr>
+        <w:numPr>
+          <w:ilvl w:val="0"/>
+          <w:numId w:val="41"/>
+        </w:numPr>
+        <w:spacing w:line="360" w:lineRule="auto"/>
+        <w:rPr>
+          <w:rFonts w:ascii="Times New Roman" w:hAnsi="Times New Roman" w:cs="Times New Roman"/>
+        </w:rPr>
+      </w:pPr>
+      <w:r>
+        <w:rPr>
+          <w:rFonts w:ascii="Times New Roman" w:hAnsi="Times New Roman" w:cs="Times New Roman"/>
+        </w:rPr>
+        <w:t>Managing proposal visibility based on user roles</w:t>
+      </w:r>
+    </w:p>
+    <w:p>
+      <w:pPr>
+        <w:numPr>
+          <w:ilvl w:val="0"/>
+          <w:numId w:val="41"/>
+        </w:numPr>
+        <w:spacing w:line="360" w:lineRule="auto"/>
+        <w:rPr>
+          <w:rFonts w:ascii="Times New Roman" w:hAnsi="Times New Roman" w:cs="Times New Roman"/>
+        </w:rPr>
+      </w:pPr>
+      <w:r>
+        <w:rPr>
+          <w:rFonts w:ascii="Times New Roman" w:hAnsi="Times New Roman" w:cs="Times New Roman"/>
+        </w:rPr>
+        <w:t>Preventing duplicate proposals</w:t>
+      </w:r>
+    </w:p>
+    <w:p>
+      <w:pPr>
+        <w:numPr>
+          <w:ilvl w:val="0"/>
+          <w:numId w:val="41"/>
+        </w:numPr>
+        <w:spacing w:line="360" w:lineRule="auto"/>
+        <w:rPr>
+          <w:rFonts w:ascii="Times New Roman" w:hAnsi="Times New Roman" w:cs="Times New Roman"/>
+        </w:rPr>
+      </w:pPr>
+      <w:r>
+        <w:rPr>
+          <w:rFonts w:ascii="Times New Roman" w:hAnsi="Times New Roman" w:cs="Times New Roman"/>
+        </w:rPr>
+        <w:t>Handling secure API communication using JWT</w:t>
+      </w:r>
+    </w:p>
+    <w:p>
+      <w:pPr>
+        <w:spacing w:line="360" w:lineRule="auto"/>
+        <w:rPr>
+          <w:rFonts w:ascii="Times New Roman" w:hAnsi="Times New Roman" w:cs="Times New Roman"/>
+        </w:rPr>
+      </w:pPr>
+      <w:r>
+        <w:rPr>
+          <w:rFonts w:ascii="Times New Roman" w:hAnsi="Times New Roman" w:cs="Times New Roman"/>
+          <w:b/>
+          <w:bCs/>
+        </w:rPr>
+        <w:t>LEARNINGS</w:t>
+      </w:r>
+    </w:p>
+    <w:p>
+      <w:pPr>
+        <w:numPr>
+          <w:ilvl w:val="0"/>
+          <w:numId w:val="41"/>
+        </w:numPr>
+        <w:spacing w:line="360" w:lineRule="auto"/>
+        <w:rPr>
+          <w:rFonts w:ascii="Times New Roman" w:hAnsi="Times New Roman" w:cs="Times New Roman"/>
+        </w:rPr>
+      </w:pPr>
+      <w:r>
+        <w:rPr>
+          <w:rFonts w:ascii="Times New Roman" w:hAnsi="Times New Roman" w:cs="Times New Roman"/>
+        </w:rPr>
+        <w:t>Designing proposal-based marketplace workflows</w:t>
+      </w:r>
+    </w:p>
+    <w:p>
+      <w:pPr>
+        <w:numPr>
+          <w:ilvl w:val="0"/>
+          <w:numId w:val="41"/>
+        </w:numPr>
+        <w:spacing w:line="360" w:lineRule="auto"/>
+        <w:rPr>
+          <w:rFonts w:ascii="Times New Roman" w:hAnsi="Times New Roman" w:cs="Times New Roman"/>
+        </w:rPr>
+      </w:pPr>
+      <w:r>
+        <w:rPr>
+          <w:rFonts w:ascii="Times New Roman" w:hAnsi="Times New Roman" w:cs="Times New Roman"/>
+        </w:rPr>
+        <w:t>Implementing role-based permissions using Django REST Framework</w:t>
+      </w:r>
+    </w:p>
+    <w:p>
+      <w:pPr>
+        <w:numPr>
+          <w:ilvl w:val="0"/>
+          <w:numId w:val="41"/>
+        </w:numPr>
+        <w:spacing w:line="360" w:lineRule="auto"/>
+        <w:rPr>
+          <w:rFonts w:ascii="Times New Roman" w:hAnsi="Times New Roman" w:cs="Times New Roman"/>
+        </w:rPr>
+      </w:pPr>
+      <w:r>
+        <w:rPr>
+          <w:rFonts w:ascii="Times New Roman" w:hAnsi="Times New Roman" w:cs="Times New Roman"/>
+        </w:rPr>
+        <w:t>Integrating React frontend with secured backend APIs</w:t>
+      </w:r>
+    </w:p>
+    <w:p>
+      <w:pPr>
+        <w:numPr>
+          <w:ilvl w:val="0"/>
+          <w:numId w:val="41"/>
+        </w:numPr>
+        <w:spacing w:line="360" w:lineRule="auto"/>
+        <w:rPr>
+          <w:rFonts w:ascii="Times New Roman" w:hAnsi="Times New Roman" w:cs="Times New Roman"/>
+        </w:rPr>
+      </w:pPr>
+      <w:r>
+        <w:rPr>
+          <w:rFonts w:ascii="Times New Roman" w:hAnsi="Times New Roman" w:cs="Times New Roman"/>
+        </w:rPr>
+        <w:t>Building clean, reusable, and user-friendly UI components</w:t>
+      </w:r>
+    </w:p>
+    <w:p>
+      <w:pPr>
+        <w:spacing w:line="360" w:lineRule="auto"/>
+        <w:rPr>
+          <w:rFonts w:ascii="Times New Roman" w:hAnsi="Times New Roman" w:cs="Times New Roman"/>
+          <w:b/>
+          <w:bCs/>
+        </w:rPr>
+      </w:pPr>
+      <w:r>
+        <w:rPr>
+          <w:rFonts w:ascii="Times New Roman" w:hAnsi="Times New Roman" w:cs="Times New Roman"/>
+          <w:b/>
+          <w:bCs/>
+        </w:rPr>
+        <w:t>CONCLUSION</w:t>
+      </w:r>
+    </w:p>
+    <w:p>
+      <w:pPr>
+        <w:spacing w:line="360" w:lineRule="auto"/>
         <w:ind w:firstLine="720"/>
         <w:rPr>
           <w:rFonts w:ascii="Times New Roman" w:hAnsi="Times New Roman" w:cs="Times New Roman"/>
@@ -1715,7 +2073,13 @@
         <w:rPr>
           <w:rFonts w:ascii="Times New Roman" w:hAnsi="Times New Roman" w:cs="Times New Roman"/>
         </w:rPr>
-        <w:t xml:space="preserve">Week 3 delivered core marketplace functionality: freelancers can now showcase their expertise, clients can post and manage projects, and both can find matches efficiently. </w:t>
+        <w:t>C</w:t>
+      </w:r>
+      <w:r>
+        <w:rPr>
+          <w:rFonts w:ascii="Times New Roman" w:hAnsi="Times New Roman" w:cs="Times New Roman"/>
+        </w:rPr>
+        <w:t xml:space="preserve">ompleted the freelancer–client interaction process in </w:t>
       </w:r>
       <w:proofErr w:type="spellStart"/>
       <w:r>
@@ -1729,7 +2093,21 @@
         <w:rPr>
           <w:rFonts w:ascii="Times New Roman" w:hAnsi="Times New Roman" w:cs="Times New Roman"/>
         </w:rPr>
-        <w:t xml:space="preserve"> is now ready for real-world use and future expansions.</w:t>
+        <w:t xml:space="preserve">. Freelancers can now submit proposals, and clients can review and manage them through the platform. These features make </w:t>
+      </w:r>
+      <w:proofErr w:type="spellStart"/>
+      <w:r>
+        <w:rPr>
+          <w:rFonts w:ascii="Times New Roman" w:hAnsi="Times New Roman" w:cs="Times New Roman"/>
+        </w:rPr>
+        <w:t>TalentLink</w:t>
+      </w:r>
+      <w:proofErr w:type="spellEnd"/>
+      <w:r>
+        <w:rPr>
+          <w:rFonts w:ascii="Times New Roman" w:hAnsi="Times New Roman" w:cs="Times New Roman"/>
+        </w:rPr>
+        <w:t xml:space="preserve"> more practical and ready for further development.</w:t>
       </w:r>
     </w:p>
     <w:sectPr>
@@ -1745,6 +2123,155 @@
 <file path=word/numbering.xml><?xml version="1.0" encoding="utf-8"?>
 <w:numbering xmlns:wpc="http://schemas.microsoft.com/office/word/2010/wordprocessingCanvas" xmlns:cx="http://schemas.microsoft.com/office/drawing/2014/chartex" xmlns:cx1="http://schemas.microsoft.com/office/drawing/2015/9/8/chartex" xmlns:cx2="http://schemas.microsoft.com/office/drawing/2015/10/21/chartex" xmlns:cx3="http://schemas.microsoft.com/office/drawing/2016/5/9/chartex" xmlns:cx4="http://schemas.microsoft.com/office/drawing/2016/5/10/chartex" xmlns:cx5="http://schemas.microsoft.com/office/drawing/2016/5/11/chartex" xmlns:cx6="http://schemas.microsoft.com/office/drawing/2016/5/12/chartex" xmlns:cx7="http://schemas.microsoft.com/office/drawing/2016/5/13/chartex" xmlns:cx8="http://schemas.microsoft.com/office/drawing/2016/5/14/chartex" xmlns:mc="http://schemas.openxmlformats.org/markup-compatibility/2006" xmlns:aink="http://schemas.microsoft.com/office/drawing/2016/ink" xmlns:am3d="http://schemas.microsoft.com/office/drawing/2017/model3d" xmlns:o="urn:schemas-microsoft-com:office:office" xmlns:oel="http://schemas.microsoft.com/office/2019/extlst" xmlns:r="http://schemas.openxmlformats.org/officeDocument/2006/relationships" xmlns:m="http://schemas.openxmlformats.org/officeDocument/2006/math" xmlns:v="urn:schemas-microsoft-com:vml" xmlns:wp14="http://schemas.microsoft.com/office/word/2010/wordprocessingDrawing" xmlns:wp="http://schemas.openxmlformats.org/drawingml/2006/wordprocessingDrawing" xmlns:w10="urn:schemas-microsoft-com:office:word" xmlns:w="http://schemas.openxmlformats.org/wordprocessingml/2006/main" xmlns:w14="http://schemas.microsoft.com/office/word/2010/wordml" xmlns:w15="http://schemas.microsoft.com/office/word/2012/wordml" xmlns:w16cex="http://schemas.microsoft.com/office/word/2018/wordml/cex" xmlns:w16cid="http://schemas.microsoft.com/office/word/2016/wordml/cid" xmlns:w16="http://schemas.microsoft.com/office/word/2018/wordml" xmlns:w16du="http://schemas.microsoft.com/office/word/2023/wordml/word16du" xmlns:w16sdtdh="http://schemas.microsoft.com/office/word/2020/wordml/sdtdatahash" xmlns:w16sdtfl="http://schemas.microsoft.com/office/word/2024/wordml/sdtformatlock" xmlns:w16se="http://schemas.microsoft.com/office/word/2015/wordml/symex" xmlns:wpg="http://schemas.microsoft.com/office/word/2010/wordprocessingGroup" xmlns:wpi="http://schemas.microsoft.com/office/word/2010/wordprocessingInk" xmlns:wne="http://schemas.microsoft.com/office/word/2006/wordml" xmlns:wps="http://schemas.microsoft.com/office/word/2010/wordprocessingShape" mc:Ignorable="w14 w15 w16se w16cid w16 w16cex w16sdtdh w16sdtfl w16du wp14">
   <w:abstractNum w:abstractNumId="0" w15:restartNumberingAfterBreak="0">
+    <w:nsid w:val="02D01D2B"/>
+    <w:multiLevelType w:val="multilevel"/>
+    <w:tmpl w:val="795891F0"/>
+    <w:lvl w:ilvl="0">
+      <w:start w:val="1"/>
+      <w:numFmt w:val="bullet"/>
+      <w:lvlText w:val=""/>
+      <w:lvlJc w:val="left"/>
+      <w:pPr>
+        <w:tabs>
+          <w:tab w:val="num" w:pos="720"/>
+        </w:tabs>
+        <w:ind w:left="720" w:hanging="360"/>
+      </w:pPr>
+      <w:rPr>
+        <w:rFonts w:ascii="Symbol" w:hAnsi="Symbol" w:hint="default"/>
+        <w:sz w:val="20"/>
+      </w:rPr>
+    </w:lvl>
+    <w:lvl w:ilvl="1" w:tentative="1">
+      <w:start w:val="1"/>
+      <w:numFmt w:val="bullet"/>
+      <w:lvlText w:val="o"/>
+      <w:lvlJc w:val="left"/>
+      <w:pPr>
+        <w:tabs>
+          <w:tab w:val="num" w:pos="1440"/>
+        </w:tabs>
+        <w:ind w:left="1440" w:hanging="360"/>
+      </w:pPr>
+      <w:rPr>
+        <w:rFonts w:ascii="Courier New" w:hAnsi="Courier New" w:hint="default"/>
+        <w:sz w:val="20"/>
+      </w:rPr>
+    </w:lvl>
+    <w:lvl w:ilvl="2" w:tentative="1">
+      <w:start w:val="1"/>
+      <w:numFmt w:val="bullet"/>
+      <w:lvlText w:val=""/>
+      <w:lvlJc w:val="left"/>
+      <w:pPr>
+        <w:tabs>
+          <w:tab w:val="num" w:pos="2160"/>
+        </w:tabs>
+        <w:ind w:left="2160" w:hanging="360"/>
+      </w:pPr>
+      <w:rPr>
+        <w:rFonts w:ascii="Wingdings" w:hAnsi="Wingdings" w:hint="default"/>
+        <w:sz w:val="20"/>
+      </w:rPr>
+    </w:lvl>
+    <w:lvl w:ilvl="3" w:tentative="1">
+      <w:start w:val="1"/>
+      <w:numFmt w:val="bullet"/>
+      <w:lvlText w:val=""/>
+      <w:lvlJc w:val="left"/>
+      <w:pPr>
+        <w:tabs>
+          <w:tab w:val="num" w:pos="2880"/>
+        </w:tabs>
+        <w:ind w:left="2880" w:hanging="360"/>
+      </w:pPr>
+      <w:rPr>
+        <w:rFonts w:ascii="Wingdings" w:hAnsi="Wingdings" w:hint="default"/>
+        <w:sz w:val="20"/>
+      </w:rPr>
+    </w:lvl>
+    <w:lvl w:ilvl="4" w:tentative="1">
+      <w:start w:val="1"/>
+      <w:numFmt w:val="bullet"/>
+      <w:lvlText w:val=""/>
+      <w:lvlJc w:val="left"/>
+      <w:pPr>
+        <w:tabs>
+          <w:tab w:val="num" w:pos="3600"/>
+        </w:tabs>
+        <w:ind w:left="3600" w:hanging="360"/>
+      </w:pPr>
+      <w:rPr>
+        <w:rFonts w:ascii="Wingdings" w:hAnsi="Wingdings" w:hint="default"/>
+        <w:sz w:val="20"/>
+      </w:rPr>
+    </w:lvl>
+    <w:lvl w:ilvl="5" w:tentative="1">
+      <w:start w:val="1"/>
+      <w:numFmt w:val="bullet"/>
+      <w:lvlText w:val=""/>
+      <w:lvlJc w:val="left"/>
+      <w:pPr>
+        <w:tabs>
+          <w:tab w:val="num" w:pos="4320"/>
+        </w:tabs>
+        <w:ind w:left="4320" w:hanging="360"/>
+      </w:pPr>
+      <w:rPr>
+        <w:rFonts w:ascii="Wingdings" w:hAnsi="Wingdings" w:hint="default"/>
+        <w:sz w:val="20"/>
+      </w:rPr>
+    </w:lvl>
+    <w:lvl w:ilvl="6" w:tentative="1">
+      <w:start w:val="1"/>
+      <w:numFmt w:val="bullet"/>
+      <w:lvlText w:val=""/>
+      <w:lvlJc w:val="left"/>
+      <w:pPr>
+        <w:tabs>
+          <w:tab w:val="num" w:pos="5040"/>
+        </w:tabs>
+        <w:ind w:left="5040" w:hanging="360"/>
+      </w:pPr>
+      <w:rPr>
+        <w:rFonts w:ascii="Wingdings" w:hAnsi="Wingdings" w:hint="default"/>
+        <w:sz w:val="20"/>
+      </w:rPr>
+    </w:lvl>
+    <w:lvl w:ilvl="7" w:tentative="1">
+      <w:start w:val="1"/>
+      <w:numFmt w:val="bullet"/>
+      <w:lvlText w:val=""/>
+      <w:lvlJc w:val="left"/>
+      <w:pPr>
+        <w:tabs>
+          <w:tab w:val="num" w:pos="5760"/>
+        </w:tabs>
+        <w:ind w:left="5760" w:hanging="360"/>
+      </w:pPr>
+      <w:rPr>
+        <w:rFonts w:ascii="Wingdings" w:hAnsi="Wingdings" w:hint="default"/>
+        <w:sz w:val="20"/>
+      </w:rPr>
+    </w:lvl>
+    <w:lvl w:ilvl="8" w:tentative="1">
+      <w:start w:val="1"/>
+      <w:numFmt w:val="bullet"/>
+      <w:lvlText w:val=""/>
+      <w:lvlJc w:val="left"/>
+      <w:pPr>
+        <w:tabs>
+          <w:tab w:val="num" w:pos="6480"/>
+        </w:tabs>
+        <w:ind w:left="6480" w:hanging="360"/>
+      </w:pPr>
+      <w:rPr>
+        <w:rFonts w:ascii="Wingdings" w:hAnsi="Wingdings" w:hint="default"/>
+        <w:sz w:val="20"/>
+      </w:rPr>
+    </w:lvl>
+  </w:abstractNum>
+  <w:abstractNum w:abstractNumId="1" w15:restartNumberingAfterBreak="0">
     <w:nsid w:val="036F6FCF"/>
     <w:multiLevelType w:val="hybridMultilevel"/>
     <w:tmpl w:val="496E51B4"/>
@@ -1857,7 +2384,7 @@
       </w:rPr>
     </w:lvl>
   </w:abstractNum>
-  <w:abstractNum w:abstractNumId="1" w15:restartNumberingAfterBreak="0">
+  <w:abstractNum w:abstractNumId="2" w15:restartNumberingAfterBreak="0">
     <w:nsid w:val="043B05E4"/>
     <w:multiLevelType w:val="hybridMultilevel"/>
     <w:tmpl w:val="50B20BAA"/>
@@ -1970,7 +2497,7 @@
       </w:rPr>
     </w:lvl>
   </w:abstractNum>
-  <w:abstractNum w:abstractNumId="2" w15:restartNumberingAfterBreak="0">
+  <w:abstractNum w:abstractNumId="3" w15:restartNumberingAfterBreak="0">
     <w:nsid w:val="094A1E9C"/>
     <w:multiLevelType w:val="multilevel"/>
     <w:tmpl w:val="100ABBD8"/>
@@ -2087,7 +2614,7 @@
       </w:pPr>
     </w:lvl>
   </w:abstractNum>
-  <w:abstractNum w:abstractNumId="3" w15:restartNumberingAfterBreak="0">
+  <w:abstractNum w:abstractNumId="4" w15:restartNumberingAfterBreak="0">
     <w:nsid w:val="0A185A98"/>
     <w:multiLevelType w:val="multilevel"/>
     <w:tmpl w:val="9EAE16F4"/>
@@ -2236,7 +2763,7 @@
       </w:rPr>
     </w:lvl>
   </w:abstractNum>
-  <w:abstractNum w:abstractNumId="4" w15:restartNumberingAfterBreak="0">
+  <w:abstractNum w:abstractNumId="5" w15:restartNumberingAfterBreak="0">
     <w:nsid w:val="0F086161"/>
     <w:multiLevelType w:val="multilevel"/>
     <w:tmpl w:val="2B26C9FA"/>
@@ -2385,7 +2912,7 @@
       </w:rPr>
     </w:lvl>
   </w:abstractNum>
-  <w:abstractNum w:abstractNumId="5" w15:restartNumberingAfterBreak="0">
+  <w:abstractNum w:abstractNumId="6" w15:restartNumberingAfterBreak="0">
     <w:nsid w:val="0F283305"/>
     <w:multiLevelType w:val="multilevel"/>
     <w:tmpl w:val="15FE31AC"/>
@@ -2534,7 +3061,7 @@
       </w:rPr>
     </w:lvl>
   </w:abstractNum>
-  <w:abstractNum w:abstractNumId="6" w15:restartNumberingAfterBreak="0">
+  <w:abstractNum w:abstractNumId="7" w15:restartNumberingAfterBreak="0">
     <w:nsid w:val="10180C14"/>
     <w:multiLevelType w:val="multilevel"/>
     <w:tmpl w:val="057CAE4E"/>
@@ -2683,7 +3210,7 @@
       </w:rPr>
     </w:lvl>
   </w:abstractNum>
-  <w:abstractNum w:abstractNumId="7" w15:restartNumberingAfterBreak="0">
+  <w:abstractNum w:abstractNumId="8" w15:restartNumberingAfterBreak="0">
     <w:nsid w:val="103A3C10"/>
     <w:multiLevelType w:val="multilevel"/>
     <w:tmpl w:val="049077A0"/>
@@ -2832,7 +3359,7 @@
       </w:rPr>
     </w:lvl>
   </w:abstractNum>
-  <w:abstractNum w:abstractNumId="8" w15:restartNumberingAfterBreak="0">
+  <w:abstractNum w:abstractNumId="9" w15:restartNumberingAfterBreak="0">
     <w:nsid w:val="136A0E1C"/>
     <w:multiLevelType w:val="multilevel"/>
     <w:tmpl w:val="F7B234B8"/>
@@ -2981,7 +3508,7 @@
       </w:rPr>
     </w:lvl>
   </w:abstractNum>
-  <w:abstractNum w:abstractNumId="9" w15:restartNumberingAfterBreak="0">
+  <w:abstractNum w:abstractNumId="10" w15:restartNumberingAfterBreak="0">
     <w:nsid w:val="14B80FBE"/>
     <w:multiLevelType w:val="multilevel"/>
     <w:tmpl w:val="1EFA9EBC"/>
@@ -3130,7 +3657,156 @@
       </w:rPr>
     </w:lvl>
   </w:abstractNum>
-  <w:abstractNum w:abstractNumId="10" w15:restartNumberingAfterBreak="0">
+  <w:abstractNum w:abstractNumId="11" w15:restartNumberingAfterBreak="0">
+    <w:nsid w:val="15CB302F"/>
+    <w:multiLevelType w:val="multilevel"/>
+    <w:tmpl w:val="6B5C4690"/>
+    <w:lvl w:ilvl="0">
+      <w:start w:val="1"/>
+      <w:numFmt w:val="bullet"/>
+      <w:lvlText w:val=""/>
+      <w:lvlJc w:val="left"/>
+      <w:pPr>
+        <w:tabs>
+          <w:tab w:val="num" w:pos="720"/>
+        </w:tabs>
+        <w:ind w:left="720" w:hanging="360"/>
+      </w:pPr>
+      <w:rPr>
+        <w:rFonts w:ascii="Symbol" w:hAnsi="Symbol" w:hint="default"/>
+        <w:sz w:val="20"/>
+      </w:rPr>
+    </w:lvl>
+    <w:lvl w:ilvl="1" w:tentative="1">
+      <w:start w:val="1"/>
+      <w:numFmt w:val="bullet"/>
+      <w:lvlText w:val="o"/>
+      <w:lvlJc w:val="left"/>
+      <w:pPr>
+        <w:tabs>
+          <w:tab w:val="num" w:pos="1440"/>
+        </w:tabs>
+        <w:ind w:left="1440" w:hanging="360"/>
+      </w:pPr>
+      <w:rPr>
+        <w:rFonts w:ascii="Courier New" w:hAnsi="Courier New" w:hint="default"/>
+        <w:sz w:val="20"/>
+      </w:rPr>
+    </w:lvl>
+    <w:lvl w:ilvl="2" w:tentative="1">
+      <w:start w:val="1"/>
+      <w:numFmt w:val="bullet"/>
+      <w:lvlText w:val=""/>
+      <w:lvlJc w:val="left"/>
+      <w:pPr>
+        <w:tabs>
+          <w:tab w:val="num" w:pos="2160"/>
+        </w:tabs>
+        <w:ind w:left="2160" w:hanging="360"/>
+      </w:pPr>
+      <w:rPr>
+        <w:rFonts w:ascii="Wingdings" w:hAnsi="Wingdings" w:hint="default"/>
+        <w:sz w:val="20"/>
+      </w:rPr>
+    </w:lvl>
+    <w:lvl w:ilvl="3" w:tentative="1">
+      <w:start w:val="1"/>
+      <w:numFmt w:val="bullet"/>
+      <w:lvlText w:val=""/>
+      <w:lvlJc w:val="left"/>
+      <w:pPr>
+        <w:tabs>
+          <w:tab w:val="num" w:pos="2880"/>
+        </w:tabs>
+        <w:ind w:left="2880" w:hanging="360"/>
+      </w:pPr>
+      <w:rPr>
+        <w:rFonts w:ascii="Wingdings" w:hAnsi="Wingdings" w:hint="default"/>
+        <w:sz w:val="20"/>
+      </w:rPr>
+    </w:lvl>
+    <w:lvl w:ilvl="4" w:tentative="1">
+      <w:start w:val="1"/>
+      <w:numFmt w:val="bullet"/>
+      <w:lvlText w:val=""/>
+      <w:lvlJc w:val="left"/>
+      <w:pPr>
+        <w:tabs>
+          <w:tab w:val="num" w:pos="3600"/>
+        </w:tabs>
+        <w:ind w:left="3600" w:hanging="360"/>
+      </w:pPr>
+      <w:rPr>
+        <w:rFonts w:ascii="Wingdings" w:hAnsi="Wingdings" w:hint="default"/>
+        <w:sz w:val="20"/>
+      </w:rPr>
+    </w:lvl>
+    <w:lvl w:ilvl="5" w:tentative="1">
+      <w:start w:val="1"/>
+      <w:numFmt w:val="bullet"/>
+      <w:lvlText w:val=""/>
+      <w:lvlJc w:val="left"/>
+      <w:pPr>
+        <w:tabs>
+          <w:tab w:val="num" w:pos="4320"/>
+        </w:tabs>
+        <w:ind w:left="4320" w:hanging="360"/>
+      </w:pPr>
+      <w:rPr>
+        <w:rFonts w:ascii="Wingdings" w:hAnsi="Wingdings" w:hint="default"/>
+        <w:sz w:val="20"/>
+      </w:rPr>
+    </w:lvl>
+    <w:lvl w:ilvl="6" w:tentative="1">
+      <w:start w:val="1"/>
+      <w:numFmt w:val="bullet"/>
+      <w:lvlText w:val=""/>
+      <w:lvlJc w:val="left"/>
+      <w:pPr>
+        <w:tabs>
+          <w:tab w:val="num" w:pos="5040"/>
+        </w:tabs>
+        <w:ind w:left="5040" w:hanging="360"/>
+      </w:pPr>
+      <w:rPr>
+        <w:rFonts w:ascii="Wingdings" w:hAnsi="Wingdings" w:hint="default"/>
+        <w:sz w:val="20"/>
+      </w:rPr>
+    </w:lvl>
+    <w:lvl w:ilvl="7" w:tentative="1">
+      <w:start w:val="1"/>
+      <w:numFmt w:val="bullet"/>
+      <w:lvlText w:val=""/>
+      <w:lvlJc w:val="left"/>
+      <w:pPr>
+        <w:tabs>
+          <w:tab w:val="num" w:pos="5760"/>
+        </w:tabs>
+        <w:ind w:left="5760" w:hanging="360"/>
+      </w:pPr>
+      <w:rPr>
+        <w:rFonts w:ascii="Wingdings" w:hAnsi="Wingdings" w:hint="default"/>
+        <w:sz w:val="20"/>
+      </w:rPr>
+    </w:lvl>
+    <w:lvl w:ilvl="8" w:tentative="1">
+      <w:start w:val="1"/>
+      <w:numFmt w:val="bullet"/>
+      <w:lvlText w:val=""/>
+      <w:lvlJc w:val="left"/>
+      <w:pPr>
+        <w:tabs>
+          <w:tab w:val="num" w:pos="6480"/>
+        </w:tabs>
+        <w:ind w:left="6480" w:hanging="360"/>
+      </w:pPr>
+      <w:rPr>
+        <w:rFonts w:ascii="Wingdings" w:hAnsi="Wingdings" w:hint="default"/>
+        <w:sz w:val="20"/>
+      </w:rPr>
+    </w:lvl>
+  </w:abstractNum>
+  <w:abstractNum w:abstractNumId="12" w15:restartNumberingAfterBreak="0">
     <w:nsid w:val="18262737"/>
     <w:multiLevelType w:val="multilevel"/>
     <w:tmpl w:val="32647D7A"/>
@@ -3279,7 +3955,156 @@
       </w:rPr>
     </w:lvl>
   </w:abstractNum>
-  <w:abstractNum w:abstractNumId="11" w15:restartNumberingAfterBreak="0">
+  <w:abstractNum w:abstractNumId="13" w15:restartNumberingAfterBreak="0">
+    <w:nsid w:val="18BA46A4"/>
+    <w:multiLevelType w:val="multilevel"/>
+    <w:tmpl w:val="9CC6F948"/>
+    <w:lvl w:ilvl="0">
+      <w:start w:val="1"/>
+      <w:numFmt w:val="bullet"/>
+      <w:lvlText w:val=""/>
+      <w:lvlJc w:val="left"/>
+      <w:pPr>
+        <w:tabs>
+          <w:tab w:val="num" w:pos="720"/>
+        </w:tabs>
+        <w:ind w:left="720" w:hanging="360"/>
+      </w:pPr>
+      <w:rPr>
+        <w:rFonts w:ascii="Symbol" w:hAnsi="Symbol" w:hint="default"/>
+        <w:sz w:val="20"/>
+      </w:rPr>
+    </w:lvl>
+    <w:lvl w:ilvl="1" w:tentative="1">
+      <w:start w:val="1"/>
+      <w:numFmt w:val="bullet"/>
+      <w:lvlText w:val="o"/>
+      <w:lvlJc w:val="left"/>
+      <w:pPr>
+        <w:tabs>
+          <w:tab w:val="num" w:pos="1440"/>
+        </w:tabs>
+        <w:ind w:left="1440" w:hanging="360"/>
+      </w:pPr>
+      <w:rPr>
+        <w:rFonts w:ascii="Courier New" w:hAnsi="Courier New" w:hint="default"/>
+        <w:sz w:val="20"/>
+      </w:rPr>
+    </w:lvl>
+    <w:lvl w:ilvl="2" w:tentative="1">
+      <w:start w:val="1"/>
+      <w:numFmt w:val="bullet"/>
+      <w:lvlText w:val=""/>
+      <w:lvlJc w:val="left"/>
+      <w:pPr>
+        <w:tabs>
+          <w:tab w:val="num" w:pos="2160"/>
+        </w:tabs>
+        <w:ind w:left="2160" w:hanging="360"/>
+      </w:pPr>
+      <w:rPr>
+        <w:rFonts w:ascii="Wingdings" w:hAnsi="Wingdings" w:hint="default"/>
+        <w:sz w:val="20"/>
+      </w:rPr>
+    </w:lvl>
+    <w:lvl w:ilvl="3" w:tentative="1">
+      <w:start w:val="1"/>
+      <w:numFmt w:val="bullet"/>
+      <w:lvlText w:val=""/>
+      <w:lvlJc w:val="left"/>
+      <w:pPr>
+        <w:tabs>
+          <w:tab w:val="num" w:pos="2880"/>
+        </w:tabs>
+        <w:ind w:left="2880" w:hanging="360"/>
+      </w:pPr>
+      <w:rPr>
+        <w:rFonts w:ascii="Wingdings" w:hAnsi="Wingdings" w:hint="default"/>
+        <w:sz w:val="20"/>
+      </w:rPr>
+    </w:lvl>
+    <w:lvl w:ilvl="4" w:tentative="1">
+      <w:start w:val="1"/>
+      <w:numFmt w:val="bullet"/>
+      <w:lvlText w:val=""/>
+      <w:lvlJc w:val="left"/>
+      <w:pPr>
+        <w:tabs>
+          <w:tab w:val="num" w:pos="3600"/>
+        </w:tabs>
+        <w:ind w:left="3600" w:hanging="360"/>
+      </w:pPr>
+      <w:rPr>
+        <w:rFonts w:ascii="Wingdings" w:hAnsi="Wingdings" w:hint="default"/>
+        <w:sz w:val="20"/>
+      </w:rPr>
+    </w:lvl>
+    <w:lvl w:ilvl="5" w:tentative="1">
+      <w:start w:val="1"/>
+      <w:numFmt w:val="bullet"/>
+      <w:lvlText w:val=""/>
+      <w:lvlJc w:val="left"/>
+      <w:pPr>
+        <w:tabs>
+          <w:tab w:val="num" w:pos="4320"/>
+        </w:tabs>
+        <w:ind w:left="4320" w:hanging="360"/>
+      </w:pPr>
+      <w:rPr>
+        <w:rFonts w:ascii="Wingdings" w:hAnsi="Wingdings" w:hint="default"/>
+        <w:sz w:val="20"/>
+      </w:rPr>
+    </w:lvl>
+    <w:lvl w:ilvl="6" w:tentative="1">
+      <w:start w:val="1"/>
+      <w:numFmt w:val="bullet"/>
+      <w:lvlText w:val=""/>
+      <w:lvlJc w:val="left"/>
+      <w:pPr>
+        <w:tabs>
+          <w:tab w:val="num" w:pos="5040"/>
+        </w:tabs>
+        <w:ind w:left="5040" w:hanging="360"/>
+      </w:pPr>
+      <w:rPr>
+        <w:rFonts w:ascii="Wingdings" w:hAnsi="Wingdings" w:hint="default"/>
+        <w:sz w:val="20"/>
+      </w:rPr>
+    </w:lvl>
+    <w:lvl w:ilvl="7" w:tentative="1">
+      <w:start w:val="1"/>
+      <w:numFmt w:val="bullet"/>
+      <w:lvlText w:val=""/>
+      <w:lvlJc w:val="left"/>
+      <w:pPr>
+        <w:tabs>
+          <w:tab w:val="num" w:pos="5760"/>
+        </w:tabs>
+        <w:ind w:left="5760" w:hanging="360"/>
+      </w:pPr>
+      <w:rPr>
+        <w:rFonts w:ascii="Wingdings" w:hAnsi="Wingdings" w:hint="default"/>
+        <w:sz w:val="20"/>
+      </w:rPr>
+    </w:lvl>
+    <w:lvl w:ilvl="8" w:tentative="1">
+      <w:start w:val="1"/>
+      <w:numFmt w:val="bullet"/>
+      <w:lvlText w:val=""/>
+      <w:lvlJc w:val="left"/>
+      <w:pPr>
+        <w:tabs>
+          <w:tab w:val="num" w:pos="6480"/>
+        </w:tabs>
+        <w:ind w:left="6480" w:hanging="360"/>
+      </w:pPr>
+      <w:rPr>
+        <w:rFonts w:ascii="Wingdings" w:hAnsi="Wingdings" w:hint="default"/>
+        <w:sz w:val="20"/>
+      </w:rPr>
+    </w:lvl>
+  </w:abstractNum>
+  <w:abstractNum w:abstractNumId="14" w15:restartNumberingAfterBreak="0">
     <w:nsid w:val="1A277610"/>
     <w:multiLevelType w:val="hybridMultilevel"/>
     <w:tmpl w:val="853CB6CE"/>
@@ -3392,7 +4217,7 @@
       </w:rPr>
     </w:lvl>
   </w:abstractNum>
-  <w:abstractNum w:abstractNumId="12" w15:restartNumberingAfterBreak="0">
+  <w:abstractNum w:abstractNumId="15" w15:restartNumberingAfterBreak="0">
     <w:nsid w:val="1C522D2A"/>
     <w:multiLevelType w:val="multilevel"/>
     <w:tmpl w:val="B902165C"/>
@@ -3541,7 +4366,7 @@
       </w:rPr>
     </w:lvl>
   </w:abstractNum>
-  <w:abstractNum w:abstractNumId="13" w15:restartNumberingAfterBreak="0">
+  <w:abstractNum w:abstractNumId="16" w15:restartNumberingAfterBreak="0">
     <w:nsid w:val="1D423720"/>
     <w:multiLevelType w:val="hybridMultilevel"/>
     <w:tmpl w:val="5296DA30"/>
@@ -3654,7 +4479,156 @@
       </w:rPr>
     </w:lvl>
   </w:abstractNum>
-  <w:abstractNum w:abstractNumId="14" w15:restartNumberingAfterBreak="0">
+  <w:abstractNum w:abstractNumId="17" w15:restartNumberingAfterBreak="0">
+    <w:nsid w:val="25F305B8"/>
+    <w:multiLevelType w:val="multilevel"/>
+    <w:tmpl w:val="412E11FA"/>
+    <w:lvl w:ilvl="0">
+      <w:start w:val="1"/>
+      <w:numFmt w:val="bullet"/>
+      <w:lvlText w:val=""/>
+      <w:lvlJc w:val="left"/>
+      <w:pPr>
+        <w:tabs>
+          <w:tab w:val="num" w:pos="720"/>
+        </w:tabs>
+        <w:ind w:left="720" w:hanging="360"/>
+      </w:pPr>
+      <w:rPr>
+        <w:rFonts w:ascii="Symbol" w:hAnsi="Symbol" w:hint="default"/>
+        <w:sz w:val="20"/>
+      </w:rPr>
+    </w:lvl>
+    <w:lvl w:ilvl="1" w:tentative="1">
+      <w:start w:val="1"/>
+      <w:numFmt w:val="bullet"/>
+      <w:lvlText w:val="o"/>
+      <w:lvlJc w:val="left"/>
+      <w:pPr>
+        <w:tabs>
+          <w:tab w:val="num" w:pos="1440"/>
+        </w:tabs>
+        <w:ind w:left="1440" w:hanging="360"/>
+      </w:pPr>
+      <w:rPr>
+        <w:rFonts w:ascii="Courier New" w:hAnsi="Courier New" w:hint="default"/>
+        <w:sz w:val="20"/>
+      </w:rPr>
+    </w:lvl>
+    <w:lvl w:ilvl="2" w:tentative="1">
+      <w:start w:val="1"/>
+      <w:numFmt w:val="bullet"/>
+      <w:lvlText w:val=""/>
+      <w:lvlJc w:val="left"/>
+      <w:pPr>
+        <w:tabs>
+          <w:tab w:val="num" w:pos="2160"/>
+        </w:tabs>
+        <w:ind w:left="2160" w:hanging="360"/>
+      </w:pPr>
+      <w:rPr>
+        <w:rFonts w:ascii="Wingdings" w:hAnsi="Wingdings" w:hint="default"/>
+        <w:sz w:val="20"/>
+      </w:rPr>
+    </w:lvl>
+    <w:lvl w:ilvl="3" w:tentative="1">
+      <w:start w:val="1"/>
+      <w:numFmt w:val="bullet"/>
+      <w:lvlText w:val=""/>
+      <w:lvlJc w:val="left"/>
+      <w:pPr>
+        <w:tabs>
+          <w:tab w:val="num" w:pos="2880"/>
+        </w:tabs>
+        <w:ind w:left="2880" w:hanging="360"/>
+      </w:pPr>
+      <w:rPr>
+        <w:rFonts w:ascii="Wingdings" w:hAnsi="Wingdings" w:hint="default"/>
+        <w:sz w:val="20"/>
+      </w:rPr>
+    </w:lvl>
+    <w:lvl w:ilvl="4" w:tentative="1">
+      <w:start w:val="1"/>
+      <w:numFmt w:val="bullet"/>
+      <w:lvlText w:val=""/>
+      <w:lvlJc w:val="left"/>
+      <w:pPr>
+        <w:tabs>
+          <w:tab w:val="num" w:pos="3600"/>
+        </w:tabs>
+        <w:ind w:left="3600" w:hanging="360"/>
+      </w:pPr>
+      <w:rPr>
+        <w:rFonts w:ascii="Wingdings" w:hAnsi="Wingdings" w:hint="default"/>
+        <w:sz w:val="20"/>
+      </w:rPr>
+    </w:lvl>
+    <w:lvl w:ilvl="5" w:tentative="1">
+      <w:start w:val="1"/>
+      <w:numFmt w:val="bullet"/>
+      <w:lvlText w:val=""/>
+      <w:lvlJc w:val="left"/>
+      <w:pPr>
+        <w:tabs>
+          <w:tab w:val="num" w:pos="4320"/>
+        </w:tabs>
+        <w:ind w:left="4320" w:hanging="360"/>
+      </w:pPr>
+      <w:rPr>
+        <w:rFonts w:ascii="Wingdings" w:hAnsi="Wingdings" w:hint="default"/>
+        <w:sz w:val="20"/>
+      </w:rPr>
+    </w:lvl>
+    <w:lvl w:ilvl="6" w:tentative="1">
+      <w:start w:val="1"/>
+      <w:numFmt w:val="bullet"/>
+      <w:lvlText w:val=""/>
+      <w:lvlJc w:val="left"/>
+      <w:pPr>
+        <w:tabs>
+          <w:tab w:val="num" w:pos="5040"/>
+        </w:tabs>
+        <w:ind w:left="5040" w:hanging="360"/>
+      </w:pPr>
+      <w:rPr>
+        <w:rFonts w:ascii="Wingdings" w:hAnsi="Wingdings" w:hint="default"/>
+        <w:sz w:val="20"/>
+      </w:rPr>
+    </w:lvl>
+    <w:lvl w:ilvl="7" w:tentative="1">
+      <w:start w:val="1"/>
+      <w:numFmt w:val="bullet"/>
+      <w:lvlText w:val=""/>
+      <w:lvlJc w:val="left"/>
+      <w:pPr>
+        <w:tabs>
+          <w:tab w:val="num" w:pos="5760"/>
+        </w:tabs>
+        <w:ind w:left="5760" w:hanging="360"/>
+      </w:pPr>
+      <w:rPr>
+        <w:rFonts w:ascii="Wingdings" w:hAnsi="Wingdings" w:hint="default"/>
+        <w:sz w:val="20"/>
+      </w:rPr>
+    </w:lvl>
+    <w:lvl w:ilvl="8" w:tentative="1">
+      <w:start w:val="1"/>
+      <w:numFmt w:val="bullet"/>
+      <w:lvlText w:val=""/>
+      <w:lvlJc w:val="left"/>
+      <w:pPr>
+        <w:tabs>
+          <w:tab w:val="num" w:pos="6480"/>
+        </w:tabs>
+        <w:ind w:left="6480" w:hanging="360"/>
+      </w:pPr>
+      <w:rPr>
+        <w:rFonts w:ascii="Wingdings" w:hAnsi="Wingdings" w:hint="default"/>
+        <w:sz w:val="20"/>
+      </w:rPr>
+    </w:lvl>
+  </w:abstractNum>
+  <w:abstractNum w:abstractNumId="18" w15:restartNumberingAfterBreak="0">
     <w:nsid w:val="29972E13"/>
     <w:multiLevelType w:val="hybridMultilevel"/>
     <w:tmpl w:val="85581F08"/>
@@ -3767,7 +4741,7 @@
       </w:rPr>
     </w:lvl>
   </w:abstractNum>
-  <w:abstractNum w:abstractNumId="15" w15:restartNumberingAfterBreak="0">
+  <w:abstractNum w:abstractNumId="19" w15:restartNumberingAfterBreak="0">
     <w:nsid w:val="2B687D93"/>
     <w:multiLevelType w:val="multilevel"/>
     <w:tmpl w:val="8A869B54"/>
@@ -3916,7 +4890,7 @@
       </w:rPr>
     </w:lvl>
   </w:abstractNum>
-  <w:abstractNum w:abstractNumId="16" w15:restartNumberingAfterBreak="0">
+  <w:abstractNum w:abstractNumId="20" w15:restartNumberingAfterBreak="0">
     <w:nsid w:val="3013780C"/>
     <w:multiLevelType w:val="hybridMultilevel"/>
     <w:tmpl w:val="731C53DC"/>
@@ -4029,7 +5003,7 @@
       </w:rPr>
     </w:lvl>
   </w:abstractNum>
-  <w:abstractNum w:abstractNumId="17" w15:restartNumberingAfterBreak="0">
+  <w:abstractNum w:abstractNumId="21" w15:restartNumberingAfterBreak="0">
     <w:nsid w:val="34EB4A04"/>
     <w:multiLevelType w:val="multilevel"/>
     <w:tmpl w:val="88DCC272"/>
@@ -4178,7 +5152,7 @@
       </w:rPr>
     </w:lvl>
   </w:abstractNum>
-  <w:abstractNum w:abstractNumId="18" w15:restartNumberingAfterBreak="0">
+  <w:abstractNum w:abstractNumId="22" w15:restartNumberingAfterBreak="0">
     <w:nsid w:val="359421ED"/>
     <w:multiLevelType w:val="multilevel"/>
     <w:tmpl w:val="799A8CF4"/>
@@ -4295,7 +5269,7 @@
       </w:pPr>
     </w:lvl>
   </w:abstractNum>
-  <w:abstractNum w:abstractNumId="19" w15:restartNumberingAfterBreak="0">
+  <w:abstractNum w:abstractNumId="23" w15:restartNumberingAfterBreak="0">
     <w:nsid w:val="390D748B"/>
     <w:multiLevelType w:val="multilevel"/>
     <w:tmpl w:val="7A64EAA8"/>
@@ -4444,7 +5418,7 @@
       </w:rPr>
     </w:lvl>
   </w:abstractNum>
-  <w:abstractNum w:abstractNumId="20" w15:restartNumberingAfterBreak="0">
+  <w:abstractNum w:abstractNumId="24" w15:restartNumberingAfterBreak="0">
     <w:nsid w:val="3A157C5A"/>
     <w:multiLevelType w:val="multilevel"/>
     <w:tmpl w:val="BB124864"/>
@@ -4593,7 +5567,7 @@
       </w:rPr>
     </w:lvl>
   </w:abstractNum>
-  <w:abstractNum w:abstractNumId="21" w15:restartNumberingAfterBreak="0">
+  <w:abstractNum w:abstractNumId="25" w15:restartNumberingAfterBreak="0">
     <w:nsid w:val="3D936678"/>
     <w:multiLevelType w:val="multilevel"/>
     <w:tmpl w:val="87C6248A"/>
@@ -4706,7 +5680,7 @@
       </w:pPr>
     </w:lvl>
   </w:abstractNum>
-  <w:abstractNum w:abstractNumId="22" w15:restartNumberingAfterBreak="0">
+  <w:abstractNum w:abstractNumId="26" w15:restartNumberingAfterBreak="0">
     <w:nsid w:val="3F6B1FA5"/>
     <w:multiLevelType w:val="multilevel"/>
     <w:tmpl w:val="87E01A4E"/>
@@ -4855,7 +5829,7 @@
       </w:rPr>
     </w:lvl>
   </w:abstractNum>
-  <w:abstractNum w:abstractNumId="23" w15:restartNumberingAfterBreak="0">
+  <w:abstractNum w:abstractNumId="27" w15:restartNumberingAfterBreak="0">
     <w:nsid w:val="40C049DC"/>
     <w:multiLevelType w:val="hybridMultilevel"/>
     <w:tmpl w:val="880CA94C"/>
@@ -4968,7 +5942,7 @@
       </w:rPr>
     </w:lvl>
   </w:abstractNum>
-  <w:abstractNum w:abstractNumId="24" w15:restartNumberingAfterBreak="0">
+  <w:abstractNum w:abstractNumId="28" w15:restartNumberingAfterBreak="0">
     <w:nsid w:val="48257DCF"/>
     <w:multiLevelType w:val="multilevel"/>
     <w:tmpl w:val="6CCEAEEA"/>
@@ -5117,7 +6091,156 @@
       </w:rPr>
     </w:lvl>
   </w:abstractNum>
-  <w:abstractNum w:abstractNumId="25" w15:restartNumberingAfterBreak="0">
+  <w:abstractNum w:abstractNumId="29" w15:restartNumberingAfterBreak="0">
+    <w:nsid w:val="4D2260FC"/>
+    <w:multiLevelType w:val="multilevel"/>
+    <w:tmpl w:val="BACC9BBA"/>
+    <w:lvl w:ilvl="0">
+      <w:start w:val="1"/>
+      <w:numFmt w:val="bullet"/>
+      <w:lvlText w:val=""/>
+      <w:lvlJc w:val="left"/>
+      <w:pPr>
+        <w:tabs>
+          <w:tab w:val="num" w:pos="720"/>
+        </w:tabs>
+        <w:ind w:left="720" w:hanging="360"/>
+      </w:pPr>
+      <w:rPr>
+        <w:rFonts w:ascii="Symbol" w:hAnsi="Symbol" w:hint="default"/>
+        <w:sz w:val="20"/>
+      </w:rPr>
+    </w:lvl>
+    <w:lvl w:ilvl="1" w:tentative="1">
+      <w:start w:val="1"/>
+      <w:numFmt w:val="bullet"/>
+      <w:lvlText w:val="o"/>
+      <w:lvlJc w:val="left"/>
+      <w:pPr>
+        <w:tabs>
+          <w:tab w:val="num" w:pos="1440"/>
+        </w:tabs>
+        <w:ind w:left="1440" w:hanging="360"/>
+      </w:pPr>
+      <w:rPr>
+        <w:rFonts w:ascii="Courier New" w:hAnsi="Courier New" w:hint="default"/>
+        <w:sz w:val="20"/>
+      </w:rPr>
+    </w:lvl>
+    <w:lvl w:ilvl="2" w:tentative="1">
+      <w:start w:val="1"/>
+      <w:numFmt w:val="bullet"/>
+      <w:lvlText w:val=""/>
+      <w:lvlJc w:val="left"/>
+      <w:pPr>
+        <w:tabs>
+          <w:tab w:val="num" w:pos="2160"/>
+        </w:tabs>
+        <w:ind w:left="2160" w:hanging="360"/>
+      </w:pPr>
+      <w:rPr>
+        <w:rFonts w:ascii="Wingdings" w:hAnsi="Wingdings" w:hint="default"/>
+        <w:sz w:val="20"/>
+      </w:rPr>
+    </w:lvl>
+    <w:lvl w:ilvl="3" w:tentative="1">
+      <w:start w:val="1"/>
+      <w:numFmt w:val="bullet"/>
+      <w:lvlText w:val=""/>
+      <w:lvlJc w:val="left"/>
+      <w:pPr>
+        <w:tabs>
+          <w:tab w:val="num" w:pos="2880"/>
+        </w:tabs>
+        <w:ind w:left="2880" w:hanging="360"/>
+      </w:pPr>
+      <w:rPr>
+        <w:rFonts w:ascii="Wingdings" w:hAnsi="Wingdings" w:hint="default"/>
+        <w:sz w:val="20"/>
+      </w:rPr>
+    </w:lvl>
+    <w:lvl w:ilvl="4" w:tentative="1">
+      <w:start w:val="1"/>
+      <w:numFmt w:val="bullet"/>
+      <w:lvlText w:val=""/>
+      <w:lvlJc w:val="left"/>
+      <w:pPr>
+        <w:tabs>
+          <w:tab w:val="num" w:pos="3600"/>
+        </w:tabs>
+        <w:ind w:left="3600" w:hanging="360"/>
+      </w:pPr>
+      <w:rPr>
+        <w:rFonts w:ascii="Wingdings" w:hAnsi="Wingdings" w:hint="default"/>
+        <w:sz w:val="20"/>
+      </w:rPr>
+    </w:lvl>
+    <w:lvl w:ilvl="5" w:tentative="1">
+      <w:start w:val="1"/>
+      <w:numFmt w:val="bullet"/>
+      <w:lvlText w:val=""/>
+      <w:lvlJc w:val="left"/>
+      <w:pPr>
+        <w:tabs>
+          <w:tab w:val="num" w:pos="4320"/>
+        </w:tabs>
+        <w:ind w:left="4320" w:hanging="360"/>
+      </w:pPr>
+      <w:rPr>
+        <w:rFonts w:ascii="Wingdings" w:hAnsi="Wingdings" w:hint="default"/>
+        <w:sz w:val="20"/>
+      </w:rPr>
+    </w:lvl>
+    <w:lvl w:ilvl="6" w:tentative="1">
+      <w:start w:val="1"/>
+      <w:numFmt w:val="bullet"/>
+      <w:lvlText w:val=""/>
+      <w:lvlJc w:val="left"/>
+      <w:pPr>
+        <w:tabs>
+          <w:tab w:val="num" w:pos="5040"/>
+        </w:tabs>
+        <w:ind w:left="5040" w:hanging="360"/>
+      </w:pPr>
+      <w:rPr>
+        <w:rFonts w:ascii="Wingdings" w:hAnsi="Wingdings" w:hint="default"/>
+        <w:sz w:val="20"/>
+      </w:rPr>
+    </w:lvl>
+    <w:lvl w:ilvl="7" w:tentative="1">
+      <w:start w:val="1"/>
+      <w:numFmt w:val="bullet"/>
+      <w:lvlText w:val=""/>
+      <w:lvlJc w:val="left"/>
+      <w:pPr>
+        <w:tabs>
+          <w:tab w:val="num" w:pos="5760"/>
+        </w:tabs>
+        <w:ind w:left="5760" w:hanging="360"/>
+      </w:pPr>
+      <w:rPr>
+        <w:rFonts w:ascii="Wingdings" w:hAnsi="Wingdings" w:hint="default"/>
+        <w:sz w:val="20"/>
+      </w:rPr>
+    </w:lvl>
+    <w:lvl w:ilvl="8" w:tentative="1">
+      <w:start w:val="1"/>
+      <w:numFmt w:val="bullet"/>
+      <w:lvlText w:val=""/>
+      <w:lvlJc w:val="left"/>
+      <w:pPr>
+        <w:tabs>
+          <w:tab w:val="num" w:pos="6480"/>
+        </w:tabs>
+        <w:ind w:left="6480" w:hanging="360"/>
+      </w:pPr>
+      <w:rPr>
+        <w:rFonts w:ascii="Wingdings" w:hAnsi="Wingdings" w:hint="default"/>
+        <w:sz w:val="20"/>
+      </w:rPr>
+    </w:lvl>
+  </w:abstractNum>
+  <w:abstractNum w:abstractNumId="30" w15:restartNumberingAfterBreak="0">
     <w:nsid w:val="4FB77521"/>
     <w:multiLevelType w:val="multilevel"/>
     <w:tmpl w:val="0C86B1D6"/>
@@ -5262,7 +6385,7 @@
       </w:rPr>
     </w:lvl>
   </w:abstractNum>
-  <w:abstractNum w:abstractNumId="26" w15:restartNumberingAfterBreak="0">
+  <w:abstractNum w:abstractNumId="31" w15:restartNumberingAfterBreak="0">
     <w:nsid w:val="525A0254"/>
     <w:multiLevelType w:val="hybridMultilevel"/>
     <w:tmpl w:val="EDD21D96"/>
@@ -5348,7 +6471,7 @@
       </w:pPr>
     </w:lvl>
   </w:abstractNum>
-  <w:abstractNum w:abstractNumId="27" w15:restartNumberingAfterBreak="0">
+  <w:abstractNum w:abstractNumId="32" w15:restartNumberingAfterBreak="0">
     <w:nsid w:val="553A5252"/>
     <w:multiLevelType w:val="multilevel"/>
     <w:tmpl w:val="D06A125A"/>
@@ -5497,7 +6620,7 @@
       </w:rPr>
     </w:lvl>
   </w:abstractNum>
-  <w:abstractNum w:abstractNumId="28" w15:restartNumberingAfterBreak="0">
+  <w:abstractNum w:abstractNumId="33" w15:restartNumberingAfterBreak="0">
     <w:nsid w:val="5B9F246E"/>
     <w:multiLevelType w:val="multilevel"/>
     <w:tmpl w:val="8536F3FE"/>
@@ -5646,7 +6769,156 @@
       </w:rPr>
     </w:lvl>
   </w:abstractNum>
-  <w:abstractNum w:abstractNumId="29" w15:restartNumberingAfterBreak="0">
+  <w:abstractNum w:abstractNumId="34" w15:restartNumberingAfterBreak="0">
+    <w:nsid w:val="61FF2DB3"/>
+    <w:multiLevelType w:val="multilevel"/>
+    <w:tmpl w:val="B9E29BD8"/>
+    <w:lvl w:ilvl="0">
+      <w:start w:val="1"/>
+      <w:numFmt w:val="bullet"/>
+      <w:lvlText w:val=""/>
+      <w:lvlJc w:val="left"/>
+      <w:pPr>
+        <w:tabs>
+          <w:tab w:val="num" w:pos="720"/>
+        </w:tabs>
+        <w:ind w:left="720" w:hanging="360"/>
+      </w:pPr>
+      <w:rPr>
+        <w:rFonts w:ascii="Symbol" w:hAnsi="Symbol" w:hint="default"/>
+        <w:sz w:val="20"/>
+      </w:rPr>
+    </w:lvl>
+    <w:lvl w:ilvl="1" w:tentative="1">
+      <w:start w:val="1"/>
+      <w:numFmt w:val="bullet"/>
+      <w:lvlText w:val="o"/>
+      <w:lvlJc w:val="left"/>
+      <w:pPr>
+        <w:tabs>
+          <w:tab w:val="num" w:pos="1440"/>
+        </w:tabs>
+        <w:ind w:left="1440" w:hanging="360"/>
+      </w:pPr>
+      <w:rPr>
+        <w:rFonts w:ascii="Courier New" w:hAnsi="Courier New" w:hint="default"/>
+        <w:sz w:val="20"/>
+      </w:rPr>
+    </w:lvl>
+    <w:lvl w:ilvl="2" w:tentative="1">
+      <w:start w:val="1"/>
+      <w:numFmt w:val="bullet"/>
+      <w:lvlText w:val=""/>
+      <w:lvlJc w:val="left"/>
+      <w:pPr>
+        <w:tabs>
+          <w:tab w:val="num" w:pos="2160"/>
+        </w:tabs>
+        <w:ind w:left="2160" w:hanging="360"/>
+      </w:pPr>
+      <w:rPr>
+        <w:rFonts w:ascii="Wingdings" w:hAnsi="Wingdings" w:hint="default"/>
+        <w:sz w:val="20"/>
+      </w:rPr>
+    </w:lvl>
+    <w:lvl w:ilvl="3" w:tentative="1">
+      <w:start w:val="1"/>
+      <w:numFmt w:val="bullet"/>
+      <w:lvlText w:val=""/>
+      <w:lvlJc w:val="left"/>
+      <w:pPr>
+        <w:tabs>
+          <w:tab w:val="num" w:pos="2880"/>
+        </w:tabs>
+        <w:ind w:left="2880" w:hanging="360"/>
+      </w:pPr>
+      <w:rPr>
+        <w:rFonts w:ascii="Wingdings" w:hAnsi="Wingdings" w:hint="default"/>
+        <w:sz w:val="20"/>
+      </w:rPr>
+    </w:lvl>
+    <w:lvl w:ilvl="4" w:tentative="1">
+      <w:start w:val="1"/>
+      <w:numFmt w:val="bullet"/>
+      <w:lvlText w:val=""/>
+      <w:lvlJc w:val="left"/>
+      <w:pPr>
+        <w:tabs>
+          <w:tab w:val="num" w:pos="3600"/>
+        </w:tabs>
+        <w:ind w:left="3600" w:hanging="360"/>
+      </w:pPr>
+      <w:rPr>
+        <w:rFonts w:ascii="Wingdings" w:hAnsi="Wingdings" w:hint="default"/>
+        <w:sz w:val="20"/>
+      </w:rPr>
+    </w:lvl>
+    <w:lvl w:ilvl="5" w:tentative="1">
+      <w:start w:val="1"/>
+      <w:numFmt w:val="bullet"/>
+      <w:lvlText w:val=""/>
+      <w:lvlJc w:val="left"/>
+      <w:pPr>
+        <w:tabs>
+          <w:tab w:val="num" w:pos="4320"/>
+        </w:tabs>
+        <w:ind w:left="4320" w:hanging="360"/>
+      </w:pPr>
+      <w:rPr>
+        <w:rFonts w:ascii="Wingdings" w:hAnsi="Wingdings" w:hint="default"/>
+        <w:sz w:val="20"/>
+      </w:rPr>
+    </w:lvl>
+    <w:lvl w:ilvl="6" w:tentative="1">
+      <w:start w:val="1"/>
+      <w:numFmt w:val="bullet"/>
+      <w:lvlText w:val=""/>
+      <w:lvlJc w:val="left"/>
+      <w:pPr>
+        <w:tabs>
+          <w:tab w:val="num" w:pos="5040"/>
+        </w:tabs>
+        <w:ind w:left="5040" w:hanging="360"/>
+      </w:pPr>
+      <w:rPr>
+        <w:rFonts w:ascii="Wingdings" w:hAnsi="Wingdings" w:hint="default"/>
+        <w:sz w:val="20"/>
+      </w:rPr>
+    </w:lvl>
+    <w:lvl w:ilvl="7" w:tentative="1">
+      <w:start w:val="1"/>
+      <w:numFmt w:val="bullet"/>
+      <w:lvlText w:val=""/>
+      <w:lvlJc w:val="left"/>
+      <w:pPr>
+        <w:tabs>
+          <w:tab w:val="num" w:pos="5760"/>
+        </w:tabs>
+        <w:ind w:left="5760" w:hanging="360"/>
+      </w:pPr>
+      <w:rPr>
+        <w:rFonts w:ascii="Wingdings" w:hAnsi="Wingdings" w:hint="default"/>
+        <w:sz w:val="20"/>
+      </w:rPr>
+    </w:lvl>
+    <w:lvl w:ilvl="8" w:tentative="1">
+      <w:start w:val="1"/>
+      <w:numFmt w:val="bullet"/>
+      <w:lvlText w:val=""/>
+      <w:lvlJc w:val="left"/>
+      <w:pPr>
+        <w:tabs>
+          <w:tab w:val="num" w:pos="6480"/>
+        </w:tabs>
+        <w:ind w:left="6480" w:hanging="360"/>
+      </w:pPr>
+      <w:rPr>
+        <w:rFonts w:ascii="Wingdings" w:hAnsi="Wingdings" w:hint="default"/>
+        <w:sz w:val="20"/>
+      </w:rPr>
+    </w:lvl>
+  </w:abstractNum>
+  <w:abstractNum w:abstractNumId="35" w15:restartNumberingAfterBreak="0">
     <w:nsid w:val="67E50909"/>
     <w:multiLevelType w:val="multilevel"/>
     <w:tmpl w:val="799A8CF4"/>
@@ -5763,7 +7035,7 @@
       </w:pPr>
     </w:lvl>
   </w:abstractNum>
-  <w:abstractNum w:abstractNumId="30" w15:restartNumberingAfterBreak="0">
+  <w:abstractNum w:abstractNumId="36" w15:restartNumberingAfterBreak="0">
     <w:nsid w:val="68637269"/>
     <w:multiLevelType w:val="hybridMultilevel"/>
     <w:tmpl w:val="FFB2D2C2"/>
@@ -5876,7 +7148,7 @@
       </w:rPr>
     </w:lvl>
   </w:abstractNum>
-  <w:abstractNum w:abstractNumId="31" w15:restartNumberingAfterBreak="0">
+  <w:abstractNum w:abstractNumId="37" w15:restartNumberingAfterBreak="0">
     <w:nsid w:val="7488481A"/>
     <w:multiLevelType w:val="hybridMultilevel"/>
     <w:tmpl w:val="8662CFF6"/>
@@ -5989,7 +7261,7 @@
       </w:rPr>
     </w:lvl>
   </w:abstractNum>
-  <w:abstractNum w:abstractNumId="32" w15:restartNumberingAfterBreak="0">
+  <w:abstractNum w:abstractNumId="38" w15:restartNumberingAfterBreak="0">
     <w:nsid w:val="76195CB8"/>
     <w:multiLevelType w:val="hybridMultilevel"/>
     <w:tmpl w:val="A9F80AD6"/>
@@ -6102,7 +7374,7 @@
       </w:rPr>
     </w:lvl>
   </w:abstractNum>
-  <w:abstractNum w:abstractNumId="33" w15:restartNumberingAfterBreak="0">
+  <w:abstractNum w:abstractNumId="39" w15:restartNumberingAfterBreak="0">
     <w:nsid w:val="791A1B97"/>
     <w:multiLevelType w:val="hybridMultilevel"/>
     <w:tmpl w:val="3B94F92E"/>
@@ -6191,7 +7463,7 @@
       </w:pPr>
     </w:lvl>
   </w:abstractNum>
-  <w:abstractNum w:abstractNumId="34" w15:restartNumberingAfterBreak="0">
+  <w:abstractNum w:abstractNumId="40" w15:restartNumberingAfterBreak="0">
     <w:nsid w:val="792F43C1"/>
     <w:multiLevelType w:val="hybridMultilevel"/>
     <w:tmpl w:val="18B8CA64"/>
@@ -6304,7 +7576,7 @@
       </w:rPr>
     </w:lvl>
   </w:abstractNum>
-  <w:abstractNum w:abstractNumId="35" w15:restartNumberingAfterBreak="0">
+  <w:abstractNum w:abstractNumId="41" w15:restartNumberingAfterBreak="0">
     <w:nsid w:val="7A6A1731"/>
     <w:multiLevelType w:val="multilevel"/>
     <w:tmpl w:val="BBE27CF4"/>
@@ -6453,7 +7725,7 @@
       </w:rPr>
     </w:lvl>
   </w:abstractNum>
-  <w:abstractNum w:abstractNumId="36" w15:restartNumberingAfterBreak="0">
+  <w:abstractNum w:abstractNumId="42" w15:restartNumberingAfterBreak="0">
     <w:nsid w:val="7B745EE9"/>
     <w:multiLevelType w:val="hybridMultilevel"/>
     <w:tmpl w:val="A77AA536"/>
@@ -6566,7 +7838,7 @@
       </w:rPr>
     </w:lvl>
   </w:abstractNum>
-  <w:abstractNum w:abstractNumId="37" w15:restartNumberingAfterBreak="0">
+  <w:abstractNum w:abstractNumId="43" w15:restartNumberingAfterBreak="0">
     <w:nsid w:val="7E294465"/>
     <w:multiLevelType w:val="multilevel"/>
     <w:tmpl w:val="40DA665E"/>
@@ -6716,118 +7988,136 @@
     </w:lvl>
   </w:abstractNum>
   <w:num w:numId="1" w16cid:durableId="564610101">
+    <w:abstractNumId w:val="25"/>
+  </w:num>
+  <w:num w:numId="2" w16cid:durableId="1866670235">
+    <w:abstractNumId w:val="33"/>
+  </w:num>
+  <w:num w:numId="3" w16cid:durableId="395785893">
+    <w:abstractNumId w:val="15"/>
+  </w:num>
+  <w:num w:numId="4" w16cid:durableId="1083649069">
+    <w:abstractNumId w:val="7"/>
+  </w:num>
+  <w:num w:numId="5" w16cid:durableId="82267804">
+    <w:abstractNumId w:val="2"/>
+  </w:num>
+  <w:num w:numId="6" w16cid:durableId="1911115889">
+    <w:abstractNumId w:val="4"/>
+  </w:num>
+  <w:num w:numId="7" w16cid:durableId="1994944599">
+    <w:abstractNumId w:val="28"/>
+  </w:num>
+  <w:num w:numId="8" w16cid:durableId="263392093">
+    <w:abstractNumId w:val="41"/>
+  </w:num>
+  <w:num w:numId="9" w16cid:durableId="1179546699">
+    <w:abstractNumId w:val="20"/>
+  </w:num>
+  <w:num w:numId="10" w16cid:durableId="1799881311">
+    <w:abstractNumId w:val="9"/>
+  </w:num>
+  <w:num w:numId="11" w16cid:durableId="1777288678">
+    <w:abstractNumId w:val="22"/>
+  </w:num>
+  <w:num w:numId="12" w16cid:durableId="1083919877">
+    <w:abstractNumId w:val="32"/>
+  </w:num>
+  <w:num w:numId="13" w16cid:durableId="1520390182">
+    <w:abstractNumId w:val="8"/>
+  </w:num>
+  <w:num w:numId="14" w16cid:durableId="1200439741">
+    <w:abstractNumId w:val="43"/>
+  </w:num>
+  <w:num w:numId="15" w16cid:durableId="1256479234">
+    <w:abstractNumId w:val="26"/>
+  </w:num>
+  <w:num w:numId="16" w16cid:durableId="1532107060">
+    <w:abstractNumId w:val="24"/>
+  </w:num>
+  <w:num w:numId="17" w16cid:durableId="1819608057">
+    <w:abstractNumId w:val="3"/>
+  </w:num>
+  <w:num w:numId="18" w16cid:durableId="89467822">
+    <w:abstractNumId w:val="5"/>
+  </w:num>
+  <w:num w:numId="19" w16cid:durableId="995299492">
+    <w:abstractNumId w:val="19"/>
+  </w:num>
+  <w:num w:numId="20" w16cid:durableId="2052531159">
+    <w:abstractNumId w:val="6"/>
+  </w:num>
+  <w:num w:numId="21" w16cid:durableId="551118366">
+    <w:abstractNumId w:val="12"/>
+  </w:num>
+  <w:num w:numId="22" w16cid:durableId="47804004">
     <w:abstractNumId w:val="21"/>
   </w:num>
-  <w:num w:numId="2" w16cid:durableId="1866670235">
-    <w:abstractNumId w:val="28"/>
+  <w:num w:numId="23" w16cid:durableId="2056006170">
+    <w:abstractNumId w:val="23"/>
   </w:num>
-  <w:num w:numId="3" w16cid:durableId="395785893">
-    <w:abstractNumId w:val="12"/>
+  <w:num w:numId="24" w16cid:durableId="433941234">
+    <w:abstractNumId w:val="30"/>
   </w:num>
-  <w:num w:numId="4" w16cid:durableId="1083649069">
-    <w:abstractNumId w:val="6"/>
+  <w:num w:numId="25" w16cid:durableId="808209797">
+    <w:abstractNumId w:val="16"/>
   </w:num>
-  <w:num w:numId="5" w16cid:durableId="82267804">
+  <w:num w:numId="26" w16cid:durableId="841696847">
+    <w:abstractNumId w:val="40"/>
+  </w:num>
+  <w:num w:numId="27" w16cid:durableId="262804890">
+    <w:abstractNumId w:val="35"/>
+  </w:num>
+  <w:num w:numId="28" w16cid:durableId="1920216918">
+    <w:abstractNumId w:val="27"/>
+  </w:num>
+  <w:num w:numId="29" w16cid:durableId="345982702">
+    <w:abstractNumId w:val="31"/>
+  </w:num>
+  <w:num w:numId="30" w16cid:durableId="452672316">
+    <w:abstractNumId w:val="10"/>
+  </w:num>
+  <w:num w:numId="31" w16cid:durableId="1467704559">
     <w:abstractNumId w:val="1"/>
   </w:num>
-  <w:num w:numId="6" w16cid:durableId="1911115889">
-    <w:abstractNumId w:val="3"/>
+  <w:num w:numId="32" w16cid:durableId="1885747096">
+    <w:abstractNumId w:val="38"/>
   </w:num>
-  <w:num w:numId="7" w16cid:durableId="1994944599">
-    <w:abstractNumId w:val="24"/>
+  <w:num w:numId="33" w16cid:durableId="914243845">
+    <w:abstractNumId w:val="39"/>
   </w:num>
-  <w:num w:numId="8" w16cid:durableId="263392093">
-    <w:abstractNumId w:val="35"/>
+  <w:num w:numId="34" w16cid:durableId="117770706">
+    <w:abstractNumId w:val="37"/>
   </w:num>
-  <w:num w:numId="9" w16cid:durableId="1179546699">
-    <w:abstractNumId w:val="16"/>
+  <w:num w:numId="35" w16cid:durableId="2079091889">
+    <w:abstractNumId w:val="36"/>
   </w:num>
-  <w:num w:numId="10" w16cid:durableId="1799881311">
-    <w:abstractNumId w:val="8"/>
+  <w:num w:numId="36" w16cid:durableId="1472748363">
+    <w:abstractNumId w:val="14"/>
   </w:num>
-  <w:num w:numId="11" w16cid:durableId="1777288678">
+  <w:num w:numId="37" w16cid:durableId="16009770">
+    <w:abstractNumId w:val="42"/>
+  </w:num>
+  <w:num w:numId="38" w16cid:durableId="227497303">
     <w:abstractNumId w:val="18"/>
   </w:num>
-  <w:num w:numId="12" w16cid:durableId="1083919877">
-    <w:abstractNumId w:val="27"/>
+  <w:num w:numId="39" w16cid:durableId="1836072994">
+    <w:abstractNumId w:val="29"/>
   </w:num>
-  <w:num w:numId="13" w16cid:durableId="1520390182">
-    <w:abstractNumId w:val="7"/>
+  <w:num w:numId="40" w16cid:durableId="912277900">
+    <w:abstractNumId w:val="11"/>
   </w:num>
-  <w:num w:numId="14" w16cid:durableId="1200439741">
-    <w:abstractNumId w:val="37"/>
+  <w:num w:numId="41" w16cid:durableId="796264559">
+    <w:abstractNumId w:val="34"/>
   </w:num>
-  <w:num w:numId="15" w16cid:durableId="1256479234">
-    <w:abstractNumId w:val="22"/>
-  </w:num>
-  <w:num w:numId="16" w16cid:durableId="1532107060">
-    <w:abstractNumId w:val="20"/>
-  </w:num>
-  <w:num w:numId="17" w16cid:durableId="1819608057">
-    <w:abstractNumId w:val="2"/>
-  </w:num>
-  <w:num w:numId="18" w16cid:durableId="89467822">
-    <w:abstractNumId w:val="4"/>
-  </w:num>
-  <w:num w:numId="19" w16cid:durableId="995299492">
-    <w:abstractNumId w:val="15"/>
-  </w:num>
-  <w:num w:numId="20" w16cid:durableId="2052531159">
-    <w:abstractNumId w:val="5"/>
-  </w:num>
-  <w:num w:numId="21" w16cid:durableId="551118366">
-    <w:abstractNumId w:val="10"/>
-  </w:num>
-  <w:num w:numId="22" w16cid:durableId="47804004">
-    <w:abstractNumId w:val="17"/>
-  </w:num>
-  <w:num w:numId="23" w16cid:durableId="2056006170">
-    <w:abstractNumId w:val="19"/>
-  </w:num>
-  <w:num w:numId="24" w16cid:durableId="433941234">
-    <w:abstractNumId w:val="25"/>
-  </w:num>
-  <w:num w:numId="25" w16cid:durableId="808209797">
+  <w:num w:numId="42" w16cid:durableId="24642909">
     <w:abstractNumId w:val="13"/>
   </w:num>
-  <w:num w:numId="26" w16cid:durableId="841696847">
-    <w:abstractNumId w:val="34"/>
-  </w:num>
-  <w:num w:numId="27" w16cid:durableId="262804890">
-    <w:abstractNumId w:val="29"/>
-  </w:num>
-  <w:num w:numId="28" w16cid:durableId="1920216918">
-    <w:abstractNumId w:val="23"/>
-  </w:num>
-  <w:num w:numId="29" w16cid:durableId="345982702">
-    <w:abstractNumId w:val="26"/>
-  </w:num>
-  <w:num w:numId="30" w16cid:durableId="452672316">
-    <w:abstractNumId w:val="9"/>
-  </w:num>
-  <w:num w:numId="31" w16cid:durableId="1467704559">
+  <w:num w:numId="43" w16cid:durableId="235671383">
     <w:abstractNumId w:val="0"/>
   </w:num>
-  <w:num w:numId="32" w16cid:durableId="1885747096">
-    <w:abstractNumId w:val="32"/>
-  </w:num>
-  <w:num w:numId="33" w16cid:durableId="914243845">
-    <w:abstractNumId w:val="33"/>
-  </w:num>
-  <w:num w:numId="34" w16cid:durableId="117770706">
-    <w:abstractNumId w:val="31"/>
-  </w:num>
-  <w:num w:numId="35" w16cid:durableId="2079091889">
-    <w:abstractNumId w:val="30"/>
-  </w:num>
-  <w:num w:numId="36" w16cid:durableId="1472748363">
-    <w:abstractNumId w:val="11"/>
-  </w:num>
-  <w:num w:numId="37" w16cid:durableId="16009770">
-    <w:abstractNumId w:val="36"/>
-  </w:num>
-  <w:num w:numId="38" w16cid:durableId="227497303">
-    <w:abstractNumId w:val="14"/>
+  <w:num w:numId="44" w16cid:durableId="2004315047">
+    <w:abstractNumId w:val="17"/>
   </w:num>
 </w:numbering>
 </file>
@@ -7434,7 +8724,6 @@
   <w:style w:type="character" w:default="1" w:styleId="DefaultParagraphFont">
     <w:name w:val="Default Paragraph Font"/>
     <w:uiPriority w:val="1"/>
-    <w:semiHidden/>
     <w:unhideWhenUsed/>
   </w:style>
   <w:style w:type="table" w:default="1" w:styleId="TableNormal">

</xml_diff>

<commit_message>
Week 1 to Week 5 Task
</commit_message>
<xml_diff>
--- a/DOCUMENTATION_TALENTLINK.docx
+++ b/DOCUMENTATION_TALENTLINK.docx
@@ -2109,6 +2109,505 @@
         </w:rPr>
         <w:t xml:space="preserve"> more practical and ready for further development.</w:t>
       </w:r>
+    </w:p>
+    <w:p>
+      <w:pPr>
+        <w:spacing w:line="360" w:lineRule="auto"/>
+        <w:jc w:val="both"/>
+        <w:rPr>
+          <w:rFonts w:ascii="Times New Roman" w:hAnsi="Times New Roman" w:cs="Times New Roman"/>
+          <w:b/>
+          <w:bCs/>
+        </w:rPr>
+      </w:pPr>
+      <w:r>
+        <w:rPr>
+          <w:rFonts w:ascii="Times New Roman" w:hAnsi="Times New Roman" w:cs="Times New Roman"/>
+          <w:b/>
+          <w:bCs/>
+        </w:rPr>
+        <w:lastRenderedPageBreak/>
+        <w:t>WEEK 4 – TASK</w:t>
+      </w:r>
+      <w:r>
+        <w:rPr>
+          <w:rFonts w:ascii="Times New Roman" w:hAnsi="Times New Roman" w:cs="Times New Roman"/>
+          <w:b/>
+          <w:bCs/>
+        </w:rPr>
+        <w:t>:</w:t>
+      </w:r>
+    </w:p>
+    <w:p>
+      <w:pPr>
+        <w:spacing w:line="360" w:lineRule="auto"/>
+        <w:rPr>
+          <w:rFonts w:ascii="Times New Roman" w:hAnsi="Times New Roman" w:cs="Times New Roman"/>
+          <w:b/>
+          <w:bCs/>
+        </w:rPr>
+      </w:pPr>
+      <w:r>
+        <w:rPr>
+          <w:rFonts w:ascii="Times New Roman" w:hAnsi="Times New Roman" w:cs="Times New Roman"/>
+          <w:b/>
+          <w:bCs/>
+        </w:rPr>
+        <w:t xml:space="preserve">Date: </w:t>
+      </w:r>
+      <w:r>
+        <w:rPr>
+          <w:rFonts w:ascii="Times New Roman" w:hAnsi="Times New Roman" w:cs="Times New Roman"/>
+          <w:b/>
+          <w:bCs/>
+        </w:rPr>
+        <w:t>January 8</w:t>
+      </w:r>
+      <w:r>
+        <w:rPr>
+          <w:rFonts w:ascii="Times New Roman" w:hAnsi="Times New Roman" w:cs="Times New Roman"/>
+          <w:b/>
+          <w:bCs/>
+        </w:rPr>
+        <w:t>, 202</w:t>
+      </w:r>
+      <w:r>
+        <w:rPr>
+          <w:rFonts w:ascii="Times New Roman" w:hAnsi="Times New Roman" w:cs="Times New Roman"/>
+          <w:b/>
+          <w:bCs/>
+        </w:rPr>
+        <w:t>6</w:t>
+      </w:r>
+    </w:p>
+    <w:p>
+      <w:pPr>
+        <w:spacing w:line="360" w:lineRule="auto"/>
+        <w:rPr>
+          <w:rFonts w:ascii="Times New Roman" w:hAnsi="Times New Roman" w:cs="Times New Roman"/>
+          <w:b/>
+          <w:bCs/>
+        </w:rPr>
+      </w:pPr>
+      <w:r>
+        <w:rPr>
+          <w:rFonts w:ascii="Times New Roman" w:hAnsi="Times New Roman" w:cs="Times New Roman"/>
+          <w:b/>
+          <w:bCs/>
+        </w:rPr>
+        <w:t>INTRODUCTION</w:t>
+      </w:r>
+    </w:p>
+    <w:p>
+      <w:pPr>
+        <w:spacing w:line="360" w:lineRule="auto"/>
+        <w:ind w:firstLine="720"/>
+        <w:rPr>
+          <w:rFonts w:ascii="Times New Roman" w:hAnsi="Times New Roman" w:cs="Times New Roman"/>
+        </w:rPr>
+      </w:pPr>
+      <w:r>
+        <w:rPr>
+          <w:rFonts w:ascii="Times New Roman" w:hAnsi="Times New Roman" w:cs="Times New Roman"/>
+        </w:rPr>
+        <w:t xml:space="preserve">Week Five focused on building the contract flow and messaging system in the </w:t>
+      </w:r>
+      <w:proofErr w:type="spellStart"/>
+      <w:r>
+        <w:rPr>
+          <w:rFonts w:ascii="Times New Roman" w:hAnsi="Times New Roman" w:cs="Times New Roman"/>
+        </w:rPr>
+        <w:t>TalentLink</w:t>
+      </w:r>
+      <w:proofErr w:type="spellEnd"/>
+      <w:r>
+        <w:rPr>
+          <w:rFonts w:ascii="Times New Roman" w:hAnsi="Times New Roman" w:cs="Times New Roman"/>
+        </w:rPr>
+        <w:t xml:space="preserve"> platform. This helps clients and freelancers communicate and manage work after a proposal is accepted.</w:t>
+      </w:r>
+    </w:p>
+    <w:p>
+      <w:pPr>
+        <w:spacing w:line="360" w:lineRule="auto"/>
+        <w:rPr>
+          <w:rFonts w:ascii="Times New Roman" w:hAnsi="Times New Roman" w:cs="Times New Roman"/>
+          <w:b/>
+          <w:bCs/>
+        </w:rPr>
+      </w:pPr>
+      <w:r>
+        <w:rPr>
+          <w:rFonts w:ascii="Times New Roman" w:hAnsi="Times New Roman" w:cs="Times New Roman"/>
+          <w:b/>
+          <w:bCs/>
+        </w:rPr>
+        <w:t>TASKS COMPLETED</w:t>
+      </w:r>
+    </w:p>
+    <w:p>
+      <w:pPr>
+        <w:pStyle w:val="ListParagraph"/>
+        <w:numPr>
+          <w:ilvl w:val="0"/>
+          <w:numId w:val="48"/>
+        </w:numPr>
+        <w:spacing w:line="360" w:lineRule="auto"/>
+        <w:rPr>
+          <w:rFonts w:ascii="Times New Roman" w:hAnsi="Times New Roman" w:cs="Times New Roman"/>
+        </w:rPr>
+      </w:pPr>
+      <w:r>
+        <w:rPr>
+          <w:rFonts w:ascii="Times New Roman" w:hAnsi="Times New Roman" w:cs="Times New Roman"/>
+        </w:rPr>
+        <w:t>Created contract flow where a contract is generated after a proposal is accepted.</w:t>
+      </w:r>
+    </w:p>
+    <w:p>
+      <w:pPr>
+        <w:pStyle w:val="ListParagraph"/>
+        <w:numPr>
+          <w:ilvl w:val="0"/>
+          <w:numId w:val="48"/>
+        </w:numPr>
+        <w:spacing w:line="360" w:lineRule="auto"/>
+        <w:rPr>
+          <w:rFonts w:ascii="Times New Roman" w:hAnsi="Times New Roman" w:cs="Times New Roman"/>
+        </w:rPr>
+      </w:pPr>
+      <w:r>
+        <w:rPr>
+          <w:rFonts w:ascii="Times New Roman" w:hAnsi="Times New Roman" w:cs="Times New Roman"/>
+        </w:rPr>
+        <w:t>Implemented contract status tracking (pending, active, completed).</w:t>
+      </w:r>
+    </w:p>
+    <w:p>
+      <w:pPr>
+        <w:pStyle w:val="ListParagraph"/>
+        <w:numPr>
+          <w:ilvl w:val="0"/>
+          <w:numId w:val="48"/>
+        </w:numPr>
+        <w:spacing w:line="360" w:lineRule="auto"/>
+        <w:rPr>
+          <w:rFonts w:ascii="Times New Roman" w:hAnsi="Times New Roman" w:cs="Times New Roman"/>
+        </w:rPr>
+      </w:pPr>
+      <w:r>
+        <w:rPr>
+          <w:rFonts w:ascii="Times New Roman" w:hAnsi="Times New Roman" w:cs="Times New Roman"/>
+        </w:rPr>
+        <w:t>Connected contracts with users and proposals.</w:t>
+      </w:r>
+    </w:p>
+    <w:p>
+      <w:pPr>
+        <w:pStyle w:val="ListParagraph"/>
+        <w:numPr>
+          <w:ilvl w:val="0"/>
+          <w:numId w:val="48"/>
+        </w:numPr>
+        <w:spacing w:line="360" w:lineRule="auto"/>
+        <w:rPr>
+          <w:rFonts w:ascii="Times New Roman" w:hAnsi="Times New Roman" w:cs="Times New Roman"/>
+        </w:rPr>
+      </w:pPr>
+      <w:r>
+        <w:rPr>
+          <w:rFonts w:ascii="Times New Roman" w:hAnsi="Times New Roman" w:cs="Times New Roman"/>
+        </w:rPr>
+        <w:t>Developed messaging APIs for sending and receiving messages.</w:t>
+      </w:r>
+    </w:p>
+    <w:p>
+      <w:pPr>
+        <w:pStyle w:val="ListParagraph"/>
+        <w:numPr>
+          <w:ilvl w:val="0"/>
+          <w:numId w:val="48"/>
+        </w:numPr>
+        <w:spacing w:line="360" w:lineRule="auto"/>
+        <w:rPr>
+          <w:rFonts w:ascii="Times New Roman" w:hAnsi="Times New Roman" w:cs="Times New Roman"/>
+        </w:rPr>
+      </w:pPr>
+      <w:r>
+        <w:rPr>
+          <w:rFonts w:ascii="Times New Roman" w:hAnsi="Times New Roman" w:cs="Times New Roman"/>
+        </w:rPr>
+        <w:t>Built a simple messaging UI using REST APIs (long-polling).</w:t>
+      </w:r>
+    </w:p>
+    <w:p>
+      <w:pPr>
+        <w:pStyle w:val="ListParagraph"/>
+        <w:numPr>
+          <w:ilvl w:val="0"/>
+          <w:numId w:val="48"/>
+        </w:numPr>
+        <w:spacing w:line="360" w:lineRule="auto"/>
+        <w:rPr>
+          <w:rFonts w:ascii="Times New Roman" w:hAnsi="Times New Roman" w:cs="Times New Roman"/>
+        </w:rPr>
+      </w:pPr>
+      <w:r>
+        <w:rPr>
+          <w:rFonts w:ascii="Times New Roman" w:hAnsi="Times New Roman" w:cs="Times New Roman"/>
+        </w:rPr>
+        <w:t>Stored messages with sender, receiver, message content, and time.</w:t>
+      </w:r>
+    </w:p>
+    <w:p>
+      <w:pPr>
+        <w:pStyle w:val="ListParagraph"/>
+        <w:numPr>
+          <w:ilvl w:val="0"/>
+          <w:numId w:val="48"/>
+        </w:numPr>
+        <w:spacing w:line="360" w:lineRule="auto"/>
+        <w:rPr>
+          <w:rFonts w:ascii="Times New Roman" w:hAnsi="Times New Roman" w:cs="Times New Roman"/>
+        </w:rPr>
+      </w:pPr>
+      <w:r>
+        <w:rPr>
+          <w:rFonts w:ascii="Times New Roman" w:hAnsi="Times New Roman" w:cs="Times New Roman"/>
+        </w:rPr>
+        <w:t>Tested all APIs to ensure correct data flow.</w:t>
+      </w:r>
+    </w:p>
+    <w:p>
+      <w:pPr>
+        <w:spacing w:line="360" w:lineRule="auto"/>
+        <w:rPr>
+          <w:rFonts w:ascii="Times New Roman" w:hAnsi="Times New Roman" w:cs="Times New Roman"/>
+          <w:b/>
+          <w:bCs/>
+        </w:rPr>
+      </w:pPr>
+      <w:r>
+        <w:rPr>
+          <w:rFonts w:ascii="Times New Roman" w:hAnsi="Times New Roman" w:cs="Times New Roman"/>
+          <w:b/>
+          <w:bCs/>
+        </w:rPr>
+        <w:t>CHALLENGES FACED</w:t>
+      </w:r>
+    </w:p>
+    <w:p>
+      <w:pPr>
+        <w:pStyle w:val="ListParagraph"/>
+        <w:numPr>
+          <w:ilvl w:val="0"/>
+          <w:numId w:val="45"/>
+        </w:numPr>
+        <w:spacing w:line="360" w:lineRule="auto"/>
+        <w:rPr>
+          <w:rFonts w:ascii="Times New Roman" w:hAnsi="Times New Roman" w:cs="Times New Roman"/>
+        </w:rPr>
+      </w:pPr>
+      <w:r>
+        <w:rPr>
+          <w:rFonts w:ascii="Times New Roman" w:hAnsi="Times New Roman" w:cs="Times New Roman"/>
+        </w:rPr>
+        <w:t>Handling correct contract status updates.</w:t>
+      </w:r>
+    </w:p>
+    <w:p>
+      <w:pPr>
+        <w:pStyle w:val="ListParagraph"/>
+        <w:numPr>
+          <w:ilvl w:val="0"/>
+          <w:numId w:val="45"/>
+        </w:numPr>
+        <w:spacing w:line="360" w:lineRule="auto"/>
+        <w:rPr>
+          <w:rFonts w:ascii="Times New Roman" w:hAnsi="Times New Roman" w:cs="Times New Roman"/>
+        </w:rPr>
+      </w:pPr>
+      <w:r>
+        <w:rPr>
+          <w:rFonts w:ascii="Times New Roman" w:hAnsi="Times New Roman" w:cs="Times New Roman"/>
+        </w:rPr>
+        <w:t>Preventing duplicate contracts for the same proposal.</w:t>
+      </w:r>
+    </w:p>
+    <w:p>
+      <w:pPr>
+        <w:pStyle w:val="ListParagraph"/>
+        <w:numPr>
+          <w:ilvl w:val="0"/>
+          <w:numId w:val="45"/>
+        </w:numPr>
+        <w:spacing w:line="360" w:lineRule="auto"/>
+        <w:rPr>
+          <w:rFonts w:ascii="Times New Roman" w:hAnsi="Times New Roman" w:cs="Times New Roman"/>
+        </w:rPr>
+      </w:pPr>
+      <w:r>
+        <w:rPr>
+          <w:rFonts w:ascii="Times New Roman" w:hAnsi="Times New Roman" w:cs="Times New Roman"/>
+        </w:rPr>
+        <w:t>Displaying messages only between the correct users</w:t>
+      </w:r>
+      <w:r>
+        <w:rPr>
+          <w:rFonts w:ascii="Times New Roman" w:hAnsi="Times New Roman" w:cs="Times New Roman"/>
+        </w:rPr>
+        <w:t>.</w:t>
+      </w:r>
+    </w:p>
+    <w:p>
+      <w:pPr>
+        <w:spacing w:line="360" w:lineRule="auto"/>
+        <w:rPr>
+          <w:rFonts w:ascii="Times New Roman" w:hAnsi="Times New Roman" w:cs="Times New Roman"/>
+          <w:b/>
+          <w:bCs/>
+        </w:rPr>
+      </w:pPr>
+      <w:r>
+        <w:rPr>
+          <w:rFonts w:ascii="Times New Roman" w:hAnsi="Times New Roman" w:cs="Times New Roman"/>
+          <w:b/>
+          <w:bCs/>
+        </w:rPr>
+        <w:t>LEARNINGS</w:t>
+      </w:r>
+    </w:p>
+    <w:p>
+      <w:pPr>
+        <w:pStyle w:val="ListParagraph"/>
+        <w:numPr>
+          <w:ilvl w:val="0"/>
+          <w:numId w:val="46"/>
+        </w:numPr>
+        <w:spacing w:line="360" w:lineRule="auto"/>
+        <w:rPr>
+          <w:rFonts w:ascii="Times New Roman" w:hAnsi="Times New Roman" w:cs="Times New Roman"/>
+        </w:rPr>
+      </w:pPr>
+      <w:r>
+        <w:rPr>
+          <w:rFonts w:ascii="Times New Roman" w:hAnsi="Times New Roman" w:cs="Times New Roman"/>
+        </w:rPr>
+        <w:t>Learned how to implement contract workflow logic.</w:t>
+      </w:r>
+    </w:p>
+    <w:p>
+      <w:pPr>
+        <w:pStyle w:val="ListParagraph"/>
+        <w:numPr>
+          <w:ilvl w:val="0"/>
+          <w:numId w:val="46"/>
+        </w:numPr>
+        <w:spacing w:line="360" w:lineRule="auto"/>
+        <w:rPr>
+          <w:rFonts w:ascii="Times New Roman" w:hAnsi="Times New Roman" w:cs="Times New Roman"/>
+        </w:rPr>
+      </w:pPr>
+      <w:r>
+        <w:rPr>
+          <w:rFonts w:ascii="Times New Roman" w:hAnsi="Times New Roman" w:cs="Times New Roman"/>
+        </w:rPr>
+        <w:t>Understood how to connect multiple models in Django.</w:t>
+      </w:r>
+    </w:p>
+    <w:p>
+      <w:pPr>
+        <w:pStyle w:val="ListParagraph"/>
+        <w:numPr>
+          <w:ilvl w:val="0"/>
+          <w:numId w:val="46"/>
+        </w:numPr>
+        <w:spacing w:line="360" w:lineRule="auto"/>
+        <w:rPr>
+          <w:rFonts w:ascii="Times New Roman" w:hAnsi="Times New Roman" w:cs="Times New Roman"/>
+        </w:rPr>
+      </w:pPr>
+      <w:r>
+        <w:rPr>
+          <w:rFonts w:ascii="Times New Roman" w:hAnsi="Times New Roman" w:cs="Times New Roman"/>
+        </w:rPr>
+        <w:t>Gained experience in building secure messaging APIs.</w:t>
+      </w:r>
+    </w:p>
+    <w:p>
+      <w:pPr>
+        <w:pStyle w:val="ListParagraph"/>
+        <w:numPr>
+          <w:ilvl w:val="0"/>
+          <w:numId w:val="46"/>
+        </w:numPr>
+        <w:spacing w:line="360" w:lineRule="auto"/>
+        <w:rPr>
+          <w:rFonts w:ascii="Times New Roman" w:hAnsi="Times New Roman" w:cs="Times New Roman"/>
+        </w:rPr>
+      </w:pPr>
+      <w:r>
+        <w:rPr>
+          <w:rFonts w:ascii="Times New Roman" w:hAnsi="Times New Roman" w:cs="Times New Roman"/>
+        </w:rPr>
+        <w:t>Learned basic concepts of real-time communication.</w:t>
+      </w:r>
+    </w:p>
+    <w:p>
+      <w:pPr>
+        <w:spacing w:line="360" w:lineRule="auto"/>
+        <w:rPr>
+          <w:rFonts w:ascii="Times New Roman" w:hAnsi="Times New Roman" w:cs="Times New Roman"/>
+          <w:b/>
+          <w:bCs/>
+        </w:rPr>
+      </w:pPr>
+      <w:r>
+        <w:rPr>
+          <w:rFonts w:ascii="Times New Roman" w:hAnsi="Times New Roman" w:cs="Times New Roman"/>
+          <w:b/>
+          <w:bCs/>
+        </w:rPr>
+        <w:t>CONCLUSION</w:t>
+      </w:r>
+    </w:p>
+    <w:p>
+      <w:pPr>
+        <w:spacing w:line="360" w:lineRule="auto"/>
+        <w:ind w:firstLine="720"/>
+        <w:rPr>
+          <w:rFonts w:ascii="Times New Roman" w:hAnsi="Times New Roman" w:cs="Times New Roman"/>
+        </w:rPr>
+      </w:pPr>
+      <w:r>
+        <w:rPr>
+          <w:rFonts w:ascii="Times New Roman" w:hAnsi="Times New Roman" w:cs="Times New Roman"/>
+        </w:rPr>
+        <w:t xml:space="preserve">Week Five successfully added contract management and messaging features to </w:t>
+      </w:r>
+      <w:proofErr w:type="spellStart"/>
+      <w:r>
+        <w:rPr>
+          <w:rFonts w:ascii="Times New Roman" w:hAnsi="Times New Roman" w:cs="Times New Roman"/>
+        </w:rPr>
+        <w:t>TalentLink</w:t>
+      </w:r>
+      <w:proofErr w:type="spellEnd"/>
+      <w:r>
+        <w:rPr>
+          <w:rFonts w:ascii="Times New Roman" w:hAnsi="Times New Roman" w:cs="Times New Roman"/>
+        </w:rPr>
+        <w:t>. These features improve user interaction and make the platform more practical and professional.</w:t>
+      </w:r>
+    </w:p>
+    <w:p>
+      <w:pPr>
+        <w:spacing w:line="360" w:lineRule="auto"/>
+        <w:ind w:firstLine="720"/>
+        <w:rPr>
+          <w:rFonts w:ascii="Times New Roman" w:hAnsi="Times New Roman" w:cs="Times New Roman"/>
+        </w:rPr>
+      </w:pPr>
     </w:p>
     <w:sectPr>
       <w:pgSz w:w="11906" w:h="16838"/>
@@ -5830,6 +6329,119 @@
     </w:lvl>
   </w:abstractNum>
   <w:abstractNum w:abstractNumId="27" w15:restartNumberingAfterBreak="0">
+    <w:nsid w:val="40A65A0C"/>
+    <w:multiLevelType w:val="hybridMultilevel"/>
+    <w:tmpl w:val="7AC8CB76"/>
+    <w:lvl w:ilvl="0" w:tplc="40090001">
+      <w:start w:val="1"/>
+      <w:numFmt w:val="bullet"/>
+      <w:lvlText w:val=""/>
+      <w:lvlJc w:val="left"/>
+      <w:pPr>
+        <w:ind w:left="720" w:hanging="360"/>
+      </w:pPr>
+      <w:rPr>
+        <w:rFonts w:ascii="Symbol" w:hAnsi="Symbol" w:hint="default"/>
+      </w:rPr>
+    </w:lvl>
+    <w:lvl w:ilvl="1" w:tplc="40090003" w:tentative="1">
+      <w:start w:val="1"/>
+      <w:numFmt w:val="bullet"/>
+      <w:lvlText w:val="o"/>
+      <w:lvlJc w:val="left"/>
+      <w:pPr>
+        <w:ind w:left="1440" w:hanging="360"/>
+      </w:pPr>
+      <w:rPr>
+        <w:rFonts w:ascii="Courier New" w:hAnsi="Courier New" w:cs="Courier New" w:hint="default"/>
+      </w:rPr>
+    </w:lvl>
+    <w:lvl w:ilvl="2" w:tplc="40090005" w:tentative="1">
+      <w:start w:val="1"/>
+      <w:numFmt w:val="bullet"/>
+      <w:lvlText w:val=""/>
+      <w:lvlJc w:val="left"/>
+      <w:pPr>
+        <w:ind w:left="2160" w:hanging="360"/>
+      </w:pPr>
+      <w:rPr>
+        <w:rFonts w:ascii="Wingdings" w:hAnsi="Wingdings" w:hint="default"/>
+      </w:rPr>
+    </w:lvl>
+    <w:lvl w:ilvl="3" w:tplc="40090001" w:tentative="1">
+      <w:start w:val="1"/>
+      <w:numFmt w:val="bullet"/>
+      <w:lvlText w:val=""/>
+      <w:lvlJc w:val="left"/>
+      <w:pPr>
+        <w:ind w:left="2880" w:hanging="360"/>
+      </w:pPr>
+      <w:rPr>
+        <w:rFonts w:ascii="Symbol" w:hAnsi="Symbol" w:hint="default"/>
+      </w:rPr>
+    </w:lvl>
+    <w:lvl w:ilvl="4" w:tplc="40090003" w:tentative="1">
+      <w:start w:val="1"/>
+      <w:numFmt w:val="bullet"/>
+      <w:lvlText w:val="o"/>
+      <w:lvlJc w:val="left"/>
+      <w:pPr>
+        <w:ind w:left="3600" w:hanging="360"/>
+      </w:pPr>
+      <w:rPr>
+        <w:rFonts w:ascii="Courier New" w:hAnsi="Courier New" w:cs="Courier New" w:hint="default"/>
+      </w:rPr>
+    </w:lvl>
+    <w:lvl w:ilvl="5" w:tplc="40090005" w:tentative="1">
+      <w:start w:val="1"/>
+      <w:numFmt w:val="bullet"/>
+      <w:lvlText w:val=""/>
+      <w:lvlJc w:val="left"/>
+      <w:pPr>
+        <w:ind w:left="4320" w:hanging="360"/>
+      </w:pPr>
+      <w:rPr>
+        <w:rFonts w:ascii="Wingdings" w:hAnsi="Wingdings" w:hint="default"/>
+      </w:rPr>
+    </w:lvl>
+    <w:lvl w:ilvl="6" w:tplc="40090001" w:tentative="1">
+      <w:start w:val="1"/>
+      <w:numFmt w:val="bullet"/>
+      <w:lvlText w:val=""/>
+      <w:lvlJc w:val="left"/>
+      <w:pPr>
+        <w:ind w:left="5040" w:hanging="360"/>
+      </w:pPr>
+      <w:rPr>
+        <w:rFonts w:ascii="Symbol" w:hAnsi="Symbol" w:hint="default"/>
+      </w:rPr>
+    </w:lvl>
+    <w:lvl w:ilvl="7" w:tplc="40090003" w:tentative="1">
+      <w:start w:val="1"/>
+      <w:numFmt w:val="bullet"/>
+      <w:lvlText w:val="o"/>
+      <w:lvlJc w:val="left"/>
+      <w:pPr>
+        <w:ind w:left="5760" w:hanging="360"/>
+      </w:pPr>
+      <w:rPr>
+        <w:rFonts w:ascii="Courier New" w:hAnsi="Courier New" w:cs="Courier New" w:hint="default"/>
+      </w:rPr>
+    </w:lvl>
+    <w:lvl w:ilvl="8" w:tplc="40090005" w:tentative="1">
+      <w:start w:val="1"/>
+      <w:numFmt w:val="bullet"/>
+      <w:lvlText w:val=""/>
+      <w:lvlJc w:val="left"/>
+      <w:pPr>
+        <w:ind w:left="6480" w:hanging="360"/>
+      </w:pPr>
+      <w:rPr>
+        <w:rFonts w:ascii="Wingdings" w:hAnsi="Wingdings" w:hint="default"/>
+      </w:rPr>
+    </w:lvl>
+  </w:abstractNum>
+  <w:abstractNum w:abstractNumId="28" w15:restartNumberingAfterBreak="0">
     <w:nsid w:val="40C049DC"/>
     <w:multiLevelType w:val="hybridMultilevel"/>
     <w:tmpl w:val="880CA94C"/>
@@ -5942,7 +6554,7 @@
       </w:rPr>
     </w:lvl>
   </w:abstractNum>
-  <w:abstractNum w:abstractNumId="28" w15:restartNumberingAfterBreak="0">
+  <w:abstractNum w:abstractNumId="29" w15:restartNumberingAfterBreak="0">
     <w:nsid w:val="48257DCF"/>
     <w:multiLevelType w:val="multilevel"/>
     <w:tmpl w:val="6CCEAEEA"/>
@@ -6091,7 +6703,7 @@
       </w:rPr>
     </w:lvl>
   </w:abstractNum>
-  <w:abstractNum w:abstractNumId="29" w15:restartNumberingAfterBreak="0">
+  <w:abstractNum w:abstractNumId="30" w15:restartNumberingAfterBreak="0">
     <w:nsid w:val="4D2260FC"/>
     <w:multiLevelType w:val="multilevel"/>
     <w:tmpl w:val="BACC9BBA"/>
@@ -6240,7 +6852,7 @@
       </w:rPr>
     </w:lvl>
   </w:abstractNum>
-  <w:abstractNum w:abstractNumId="30" w15:restartNumberingAfterBreak="0">
+  <w:abstractNum w:abstractNumId="31" w15:restartNumberingAfterBreak="0">
     <w:nsid w:val="4FB77521"/>
     <w:multiLevelType w:val="multilevel"/>
     <w:tmpl w:val="0C86B1D6"/>
@@ -6385,7 +6997,7 @@
       </w:rPr>
     </w:lvl>
   </w:abstractNum>
-  <w:abstractNum w:abstractNumId="31" w15:restartNumberingAfterBreak="0">
+  <w:abstractNum w:abstractNumId="32" w15:restartNumberingAfterBreak="0">
     <w:nsid w:val="525A0254"/>
     <w:multiLevelType w:val="hybridMultilevel"/>
     <w:tmpl w:val="EDD21D96"/>
@@ -6471,7 +7083,7 @@
       </w:pPr>
     </w:lvl>
   </w:abstractNum>
-  <w:abstractNum w:abstractNumId="32" w15:restartNumberingAfterBreak="0">
+  <w:abstractNum w:abstractNumId="33" w15:restartNumberingAfterBreak="0">
     <w:nsid w:val="553A5252"/>
     <w:multiLevelType w:val="multilevel"/>
     <w:tmpl w:val="D06A125A"/>
@@ -6620,7 +7232,120 @@
       </w:rPr>
     </w:lvl>
   </w:abstractNum>
-  <w:abstractNum w:abstractNumId="33" w15:restartNumberingAfterBreak="0">
+  <w:abstractNum w:abstractNumId="34" w15:restartNumberingAfterBreak="0">
+    <w:nsid w:val="57870C41"/>
+    <w:multiLevelType w:val="hybridMultilevel"/>
+    <w:tmpl w:val="A172458E"/>
+    <w:lvl w:ilvl="0" w:tplc="40090001">
+      <w:start w:val="1"/>
+      <w:numFmt w:val="bullet"/>
+      <w:lvlText w:val=""/>
+      <w:lvlJc w:val="left"/>
+      <w:pPr>
+        <w:ind w:left="720" w:hanging="360"/>
+      </w:pPr>
+      <w:rPr>
+        <w:rFonts w:ascii="Symbol" w:hAnsi="Symbol" w:hint="default"/>
+      </w:rPr>
+    </w:lvl>
+    <w:lvl w:ilvl="1" w:tplc="40090003" w:tentative="1">
+      <w:start w:val="1"/>
+      <w:numFmt w:val="bullet"/>
+      <w:lvlText w:val="o"/>
+      <w:lvlJc w:val="left"/>
+      <w:pPr>
+        <w:ind w:left="1440" w:hanging="360"/>
+      </w:pPr>
+      <w:rPr>
+        <w:rFonts w:ascii="Courier New" w:hAnsi="Courier New" w:cs="Courier New" w:hint="default"/>
+      </w:rPr>
+    </w:lvl>
+    <w:lvl w:ilvl="2" w:tplc="40090005" w:tentative="1">
+      <w:start w:val="1"/>
+      <w:numFmt w:val="bullet"/>
+      <w:lvlText w:val=""/>
+      <w:lvlJc w:val="left"/>
+      <w:pPr>
+        <w:ind w:left="2160" w:hanging="360"/>
+      </w:pPr>
+      <w:rPr>
+        <w:rFonts w:ascii="Wingdings" w:hAnsi="Wingdings" w:hint="default"/>
+      </w:rPr>
+    </w:lvl>
+    <w:lvl w:ilvl="3" w:tplc="40090001" w:tentative="1">
+      <w:start w:val="1"/>
+      <w:numFmt w:val="bullet"/>
+      <w:lvlText w:val=""/>
+      <w:lvlJc w:val="left"/>
+      <w:pPr>
+        <w:ind w:left="2880" w:hanging="360"/>
+      </w:pPr>
+      <w:rPr>
+        <w:rFonts w:ascii="Symbol" w:hAnsi="Symbol" w:hint="default"/>
+      </w:rPr>
+    </w:lvl>
+    <w:lvl w:ilvl="4" w:tplc="40090003" w:tentative="1">
+      <w:start w:val="1"/>
+      <w:numFmt w:val="bullet"/>
+      <w:lvlText w:val="o"/>
+      <w:lvlJc w:val="left"/>
+      <w:pPr>
+        <w:ind w:left="3600" w:hanging="360"/>
+      </w:pPr>
+      <w:rPr>
+        <w:rFonts w:ascii="Courier New" w:hAnsi="Courier New" w:cs="Courier New" w:hint="default"/>
+      </w:rPr>
+    </w:lvl>
+    <w:lvl w:ilvl="5" w:tplc="40090005" w:tentative="1">
+      <w:start w:val="1"/>
+      <w:numFmt w:val="bullet"/>
+      <w:lvlText w:val=""/>
+      <w:lvlJc w:val="left"/>
+      <w:pPr>
+        <w:ind w:left="4320" w:hanging="360"/>
+      </w:pPr>
+      <w:rPr>
+        <w:rFonts w:ascii="Wingdings" w:hAnsi="Wingdings" w:hint="default"/>
+      </w:rPr>
+    </w:lvl>
+    <w:lvl w:ilvl="6" w:tplc="40090001" w:tentative="1">
+      <w:start w:val="1"/>
+      <w:numFmt w:val="bullet"/>
+      <w:lvlText w:val=""/>
+      <w:lvlJc w:val="left"/>
+      <w:pPr>
+        <w:ind w:left="5040" w:hanging="360"/>
+      </w:pPr>
+      <w:rPr>
+        <w:rFonts w:ascii="Symbol" w:hAnsi="Symbol" w:hint="default"/>
+      </w:rPr>
+    </w:lvl>
+    <w:lvl w:ilvl="7" w:tplc="40090003" w:tentative="1">
+      <w:start w:val="1"/>
+      <w:numFmt w:val="bullet"/>
+      <w:lvlText w:val="o"/>
+      <w:lvlJc w:val="left"/>
+      <w:pPr>
+        <w:ind w:left="5760" w:hanging="360"/>
+      </w:pPr>
+      <w:rPr>
+        <w:rFonts w:ascii="Courier New" w:hAnsi="Courier New" w:cs="Courier New" w:hint="default"/>
+      </w:rPr>
+    </w:lvl>
+    <w:lvl w:ilvl="8" w:tplc="40090005" w:tentative="1">
+      <w:start w:val="1"/>
+      <w:numFmt w:val="bullet"/>
+      <w:lvlText w:val=""/>
+      <w:lvlJc w:val="left"/>
+      <w:pPr>
+        <w:ind w:left="6480" w:hanging="360"/>
+      </w:pPr>
+      <w:rPr>
+        <w:rFonts w:ascii="Wingdings" w:hAnsi="Wingdings" w:hint="default"/>
+      </w:rPr>
+    </w:lvl>
+  </w:abstractNum>
+  <w:abstractNum w:abstractNumId="35" w15:restartNumberingAfterBreak="0">
     <w:nsid w:val="5B9F246E"/>
     <w:multiLevelType w:val="multilevel"/>
     <w:tmpl w:val="8536F3FE"/>
@@ -6769,7 +7494,7 @@
       </w:rPr>
     </w:lvl>
   </w:abstractNum>
-  <w:abstractNum w:abstractNumId="34" w15:restartNumberingAfterBreak="0">
+  <w:abstractNum w:abstractNumId="36" w15:restartNumberingAfterBreak="0">
     <w:nsid w:val="61FF2DB3"/>
     <w:multiLevelType w:val="multilevel"/>
     <w:tmpl w:val="B9E29BD8"/>
@@ -6918,7 +7643,233 @@
       </w:rPr>
     </w:lvl>
   </w:abstractNum>
-  <w:abstractNum w:abstractNumId="35" w15:restartNumberingAfterBreak="0">
+  <w:abstractNum w:abstractNumId="37" w15:restartNumberingAfterBreak="0">
+    <w:nsid w:val="623434C2"/>
+    <w:multiLevelType w:val="hybridMultilevel"/>
+    <w:tmpl w:val="56264EA0"/>
+    <w:lvl w:ilvl="0" w:tplc="40090001">
+      <w:start w:val="1"/>
+      <w:numFmt w:val="bullet"/>
+      <w:lvlText w:val=""/>
+      <w:lvlJc w:val="left"/>
+      <w:pPr>
+        <w:ind w:left="720" w:hanging="360"/>
+      </w:pPr>
+      <w:rPr>
+        <w:rFonts w:ascii="Symbol" w:hAnsi="Symbol" w:hint="default"/>
+      </w:rPr>
+    </w:lvl>
+    <w:lvl w:ilvl="1" w:tplc="40090003" w:tentative="1">
+      <w:start w:val="1"/>
+      <w:numFmt w:val="bullet"/>
+      <w:lvlText w:val="o"/>
+      <w:lvlJc w:val="left"/>
+      <w:pPr>
+        <w:ind w:left="1440" w:hanging="360"/>
+      </w:pPr>
+      <w:rPr>
+        <w:rFonts w:ascii="Courier New" w:hAnsi="Courier New" w:cs="Courier New" w:hint="default"/>
+      </w:rPr>
+    </w:lvl>
+    <w:lvl w:ilvl="2" w:tplc="40090005" w:tentative="1">
+      <w:start w:val="1"/>
+      <w:numFmt w:val="bullet"/>
+      <w:lvlText w:val=""/>
+      <w:lvlJc w:val="left"/>
+      <w:pPr>
+        <w:ind w:left="2160" w:hanging="360"/>
+      </w:pPr>
+      <w:rPr>
+        <w:rFonts w:ascii="Wingdings" w:hAnsi="Wingdings" w:hint="default"/>
+      </w:rPr>
+    </w:lvl>
+    <w:lvl w:ilvl="3" w:tplc="40090001" w:tentative="1">
+      <w:start w:val="1"/>
+      <w:numFmt w:val="bullet"/>
+      <w:lvlText w:val=""/>
+      <w:lvlJc w:val="left"/>
+      <w:pPr>
+        <w:ind w:left="2880" w:hanging="360"/>
+      </w:pPr>
+      <w:rPr>
+        <w:rFonts w:ascii="Symbol" w:hAnsi="Symbol" w:hint="default"/>
+      </w:rPr>
+    </w:lvl>
+    <w:lvl w:ilvl="4" w:tplc="40090003" w:tentative="1">
+      <w:start w:val="1"/>
+      <w:numFmt w:val="bullet"/>
+      <w:lvlText w:val="o"/>
+      <w:lvlJc w:val="left"/>
+      <w:pPr>
+        <w:ind w:left="3600" w:hanging="360"/>
+      </w:pPr>
+      <w:rPr>
+        <w:rFonts w:ascii="Courier New" w:hAnsi="Courier New" w:cs="Courier New" w:hint="default"/>
+      </w:rPr>
+    </w:lvl>
+    <w:lvl w:ilvl="5" w:tplc="40090005" w:tentative="1">
+      <w:start w:val="1"/>
+      <w:numFmt w:val="bullet"/>
+      <w:lvlText w:val=""/>
+      <w:lvlJc w:val="left"/>
+      <w:pPr>
+        <w:ind w:left="4320" w:hanging="360"/>
+      </w:pPr>
+      <w:rPr>
+        <w:rFonts w:ascii="Wingdings" w:hAnsi="Wingdings" w:hint="default"/>
+      </w:rPr>
+    </w:lvl>
+    <w:lvl w:ilvl="6" w:tplc="40090001" w:tentative="1">
+      <w:start w:val="1"/>
+      <w:numFmt w:val="bullet"/>
+      <w:lvlText w:val=""/>
+      <w:lvlJc w:val="left"/>
+      <w:pPr>
+        <w:ind w:left="5040" w:hanging="360"/>
+      </w:pPr>
+      <w:rPr>
+        <w:rFonts w:ascii="Symbol" w:hAnsi="Symbol" w:hint="default"/>
+      </w:rPr>
+    </w:lvl>
+    <w:lvl w:ilvl="7" w:tplc="40090003" w:tentative="1">
+      <w:start w:val="1"/>
+      <w:numFmt w:val="bullet"/>
+      <w:lvlText w:val="o"/>
+      <w:lvlJc w:val="left"/>
+      <w:pPr>
+        <w:ind w:left="5760" w:hanging="360"/>
+      </w:pPr>
+      <w:rPr>
+        <w:rFonts w:ascii="Courier New" w:hAnsi="Courier New" w:cs="Courier New" w:hint="default"/>
+      </w:rPr>
+    </w:lvl>
+    <w:lvl w:ilvl="8" w:tplc="40090005" w:tentative="1">
+      <w:start w:val="1"/>
+      <w:numFmt w:val="bullet"/>
+      <w:lvlText w:val=""/>
+      <w:lvlJc w:val="left"/>
+      <w:pPr>
+        <w:ind w:left="6480" w:hanging="360"/>
+      </w:pPr>
+      <w:rPr>
+        <w:rFonts w:ascii="Wingdings" w:hAnsi="Wingdings" w:hint="default"/>
+      </w:rPr>
+    </w:lvl>
+  </w:abstractNum>
+  <w:abstractNum w:abstractNumId="38" w15:restartNumberingAfterBreak="0">
+    <w:nsid w:val="643C1491"/>
+    <w:multiLevelType w:val="hybridMultilevel"/>
+    <w:tmpl w:val="6A9203C4"/>
+    <w:lvl w:ilvl="0" w:tplc="40090001">
+      <w:start w:val="1"/>
+      <w:numFmt w:val="bullet"/>
+      <w:lvlText w:val=""/>
+      <w:lvlJc w:val="left"/>
+      <w:pPr>
+        <w:ind w:left="720" w:hanging="360"/>
+      </w:pPr>
+      <w:rPr>
+        <w:rFonts w:ascii="Symbol" w:hAnsi="Symbol" w:hint="default"/>
+      </w:rPr>
+    </w:lvl>
+    <w:lvl w:ilvl="1" w:tplc="40090003" w:tentative="1">
+      <w:start w:val="1"/>
+      <w:numFmt w:val="bullet"/>
+      <w:lvlText w:val="o"/>
+      <w:lvlJc w:val="left"/>
+      <w:pPr>
+        <w:ind w:left="1440" w:hanging="360"/>
+      </w:pPr>
+      <w:rPr>
+        <w:rFonts w:ascii="Courier New" w:hAnsi="Courier New" w:cs="Courier New" w:hint="default"/>
+      </w:rPr>
+    </w:lvl>
+    <w:lvl w:ilvl="2" w:tplc="40090005" w:tentative="1">
+      <w:start w:val="1"/>
+      <w:numFmt w:val="bullet"/>
+      <w:lvlText w:val=""/>
+      <w:lvlJc w:val="left"/>
+      <w:pPr>
+        <w:ind w:left="2160" w:hanging="360"/>
+      </w:pPr>
+      <w:rPr>
+        <w:rFonts w:ascii="Wingdings" w:hAnsi="Wingdings" w:hint="default"/>
+      </w:rPr>
+    </w:lvl>
+    <w:lvl w:ilvl="3" w:tplc="40090001" w:tentative="1">
+      <w:start w:val="1"/>
+      <w:numFmt w:val="bullet"/>
+      <w:lvlText w:val=""/>
+      <w:lvlJc w:val="left"/>
+      <w:pPr>
+        <w:ind w:left="2880" w:hanging="360"/>
+      </w:pPr>
+      <w:rPr>
+        <w:rFonts w:ascii="Symbol" w:hAnsi="Symbol" w:hint="default"/>
+      </w:rPr>
+    </w:lvl>
+    <w:lvl w:ilvl="4" w:tplc="40090003" w:tentative="1">
+      <w:start w:val="1"/>
+      <w:numFmt w:val="bullet"/>
+      <w:lvlText w:val="o"/>
+      <w:lvlJc w:val="left"/>
+      <w:pPr>
+        <w:ind w:left="3600" w:hanging="360"/>
+      </w:pPr>
+      <w:rPr>
+        <w:rFonts w:ascii="Courier New" w:hAnsi="Courier New" w:cs="Courier New" w:hint="default"/>
+      </w:rPr>
+    </w:lvl>
+    <w:lvl w:ilvl="5" w:tplc="40090005" w:tentative="1">
+      <w:start w:val="1"/>
+      <w:numFmt w:val="bullet"/>
+      <w:lvlText w:val=""/>
+      <w:lvlJc w:val="left"/>
+      <w:pPr>
+        <w:ind w:left="4320" w:hanging="360"/>
+      </w:pPr>
+      <w:rPr>
+        <w:rFonts w:ascii="Wingdings" w:hAnsi="Wingdings" w:hint="default"/>
+      </w:rPr>
+    </w:lvl>
+    <w:lvl w:ilvl="6" w:tplc="40090001" w:tentative="1">
+      <w:start w:val="1"/>
+      <w:numFmt w:val="bullet"/>
+      <w:lvlText w:val=""/>
+      <w:lvlJc w:val="left"/>
+      <w:pPr>
+        <w:ind w:left="5040" w:hanging="360"/>
+      </w:pPr>
+      <w:rPr>
+        <w:rFonts w:ascii="Symbol" w:hAnsi="Symbol" w:hint="default"/>
+      </w:rPr>
+    </w:lvl>
+    <w:lvl w:ilvl="7" w:tplc="40090003" w:tentative="1">
+      <w:start w:val="1"/>
+      <w:numFmt w:val="bullet"/>
+      <w:lvlText w:val="o"/>
+      <w:lvlJc w:val="left"/>
+      <w:pPr>
+        <w:ind w:left="5760" w:hanging="360"/>
+      </w:pPr>
+      <w:rPr>
+        <w:rFonts w:ascii="Courier New" w:hAnsi="Courier New" w:cs="Courier New" w:hint="default"/>
+      </w:rPr>
+    </w:lvl>
+    <w:lvl w:ilvl="8" w:tplc="40090005" w:tentative="1">
+      <w:start w:val="1"/>
+      <w:numFmt w:val="bullet"/>
+      <w:lvlText w:val=""/>
+      <w:lvlJc w:val="left"/>
+      <w:pPr>
+        <w:ind w:left="6480" w:hanging="360"/>
+      </w:pPr>
+      <w:rPr>
+        <w:rFonts w:ascii="Wingdings" w:hAnsi="Wingdings" w:hint="default"/>
+      </w:rPr>
+    </w:lvl>
+  </w:abstractNum>
+  <w:abstractNum w:abstractNumId="39" w15:restartNumberingAfterBreak="0">
     <w:nsid w:val="67E50909"/>
     <w:multiLevelType w:val="multilevel"/>
     <w:tmpl w:val="799A8CF4"/>
@@ -7035,7 +7986,7 @@
       </w:pPr>
     </w:lvl>
   </w:abstractNum>
-  <w:abstractNum w:abstractNumId="36" w15:restartNumberingAfterBreak="0">
+  <w:abstractNum w:abstractNumId="40" w15:restartNumberingAfterBreak="0">
     <w:nsid w:val="68637269"/>
     <w:multiLevelType w:val="hybridMultilevel"/>
     <w:tmpl w:val="FFB2D2C2"/>
@@ -7148,7 +8099,7 @@
       </w:rPr>
     </w:lvl>
   </w:abstractNum>
-  <w:abstractNum w:abstractNumId="37" w15:restartNumberingAfterBreak="0">
+  <w:abstractNum w:abstractNumId="41" w15:restartNumberingAfterBreak="0">
     <w:nsid w:val="7488481A"/>
     <w:multiLevelType w:val="hybridMultilevel"/>
     <w:tmpl w:val="8662CFF6"/>
@@ -7261,7 +8212,7 @@
       </w:rPr>
     </w:lvl>
   </w:abstractNum>
-  <w:abstractNum w:abstractNumId="38" w15:restartNumberingAfterBreak="0">
+  <w:abstractNum w:abstractNumId="42" w15:restartNumberingAfterBreak="0">
     <w:nsid w:val="76195CB8"/>
     <w:multiLevelType w:val="hybridMultilevel"/>
     <w:tmpl w:val="A9F80AD6"/>
@@ -7374,10 +8325,10 @@
       </w:rPr>
     </w:lvl>
   </w:abstractNum>
-  <w:abstractNum w:abstractNumId="39" w15:restartNumberingAfterBreak="0">
+  <w:abstractNum w:abstractNumId="43" w15:restartNumberingAfterBreak="0">
     <w:nsid w:val="791A1B97"/>
     <w:multiLevelType w:val="hybridMultilevel"/>
-    <w:tmpl w:val="3B94F92E"/>
+    <w:tmpl w:val="092E95B6"/>
     <w:lvl w:ilvl="0" w:tplc="40090001">
       <w:start w:val="1"/>
       <w:numFmt w:val="bullet"/>
@@ -7390,14 +8341,16 @@
         <w:rFonts w:ascii="Symbol" w:hAnsi="Symbol" w:hint="default"/>
       </w:rPr>
     </w:lvl>
-    <w:lvl w:ilvl="1" w:tplc="FFFFFFFF" w:tentative="1">
-      <w:start w:val="1"/>
-      <w:numFmt w:val="lowerLetter"/>
-      <w:lvlText w:val="%2."/>
+    <w:lvl w:ilvl="1" w:tplc="FE26B746">
+      <w:numFmt w:val="bullet"/>
+      <w:lvlText w:val="•"/>
       <w:lvlJc w:val="left"/>
       <w:pPr>
         <w:ind w:left="1440" w:hanging="360"/>
       </w:pPr>
+      <w:rPr>
+        <w:rFonts w:ascii="Times New Roman" w:eastAsiaTheme="minorHAnsi" w:hAnsi="Times New Roman" w:cs="Times New Roman" w:hint="default"/>
+      </w:rPr>
     </w:lvl>
     <w:lvl w:ilvl="2" w:tplc="FFFFFFFF" w:tentative="1">
       <w:start w:val="1"/>
@@ -7463,7 +8416,7 @@
       </w:pPr>
     </w:lvl>
   </w:abstractNum>
-  <w:abstractNum w:abstractNumId="40" w15:restartNumberingAfterBreak="0">
+  <w:abstractNum w:abstractNumId="44" w15:restartNumberingAfterBreak="0">
     <w:nsid w:val="792F43C1"/>
     <w:multiLevelType w:val="hybridMultilevel"/>
     <w:tmpl w:val="18B8CA64"/>
@@ -7576,7 +8529,7 @@
       </w:rPr>
     </w:lvl>
   </w:abstractNum>
-  <w:abstractNum w:abstractNumId="41" w15:restartNumberingAfterBreak="0">
+  <w:abstractNum w:abstractNumId="45" w15:restartNumberingAfterBreak="0">
     <w:nsid w:val="7A6A1731"/>
     <w:multiLevelType w:val="multilevel"/>
     <w:tmpl w:val="BBE27CF4"/>
@@ -7725,7 +8678,7 @@
       </w:rPr>
     </w:lvl>
   </w:abstractNum>
-  <w:abstractNum w:abstractNumId="42" w15:restartNumberingAfterBreak="0">
+  <w:abstractNum w:abstractNumId="46" w15:restartNumberingAfterBreak="0">
     <w:nsid w:val="7B745EE9"/>
     <w:multiLevelType w:val="hybridMultilevel"/>
     <w:tmpl w:val="A77AA536"/>
@@ -7838,7 +8791,7 @@
       </w:rPr>
     </w:lvl>
   </w:abstractNum>
-  <w:abstractNum w:abstractNumId="43" w15:restartNumberingAfterBreak="0">
+  <w:abstractNum w:abstractNumId="47" w15:restartNumberingAfterBreak="0">
     <w:nsid w:val="7E294465"/>
     <w:multiLevelType w:val="multilevel"/>
     <w:tmpl w:val="40DA665E"/>
@@ -7991,7 +8944,7 @@
     <w:abstractNumId w:val="25"/>
   </w:num>
   <w:num w:numId="2" w16cid:durableId="1866670235">
-    <w:abstractNumId w:val="33"/>
+    <w:abstractNumId w:val="35"/>
   </w:num>
   <w:num w:numId="3" w16cid:durableId="395785893">
     <w:abstractNumId w:val="15"/>
@@ -8006,10 +8959,10 @@
     <w:abstractNumId w:val="4"/>
   </w:num>
   <w:num w:numId="7" w16cid:durableId="1994944599">
-    <w:abstractNumId w:val="28"/>
+    <w:abstractNumId w:val="29"/>
   </w:num>
   <w:num w:numId="8" w16cid:durableId="263392093">
-    <w:abstractNumId w:val="41"/>
+    <w:abstractNumId w:val="45"/>
   </w:num>
   <w:num w:numId="9" w16cid:durableId="1179546699">
     <w:abstractNumId w:val="20"/>
@@ -8021,13 +8974,13 @@
     <w:abstractNumId w:val="22"/>
   </w:num>
   <w:num w:numId="12" w16cid:durableId="1083919877">
-    <w:abstractNumId w:val="32"/>
+    <w:abstractNumId w:val="33"/>
   </w:num>
   <w:num w:numId="13" w16cid:durableId="1520390182">
     <w:abstractNumId w:val="8"/>
   </w:num>
   <w:num w:numId="14" w16cid:durableId="1200439741">
-    <w:abstractNumId w:val="43"/>
+    <w:abstractNumId w:val="47"/>
   </w:num>
   <w:num w:numId="15" w16cid:durableId="1256479234">
     <w:abstractNumId w:val="26"/>
@@ -8057,22 +9010,22 @@
     <w:abstractNumId w:val="23"/>
   </w:num>
   <w:num w:numId="24" w16cid:durableId="433941234">
-    <w:abstractNumId w:val="30"/>
+    <w:abstractNumId w:val="31"/>
   </w:num>
   <w:num w:numId="25" w16cid:durableId="808209797">
     <w:abstractNumId w:val="16"/>
   </w:num>
   <w:num w:numId="26" w16cid:durableId="841696847">
-    <w:abstractNumId w:val="40"/>
+    <w:abstractNumId w:val="44"/>
   </w:num>
   <w:num w:numId="27" w16cid:durableId="262804890">
-    <w:abstractNumId w:val="35"/>
+    <w:abstractNumId w:val="39"/>
   </w:num>
   <w:num w:numId="28" w16cid:durableId="1920216918">
-    <w:abstractNumId w:val="27"/>
+    <w:abstractNumId w:val="28"/>
   </w:num>
   <w:num w:numId="29" w16cid:durableId="345982702">
-    <w:abstractNumId w:val="31"/>
+    <w:abstractNumId w:val="32"/>
   </w:num>
   <w:num w:numId="30" w16cid:durableId="452672316">
     <w:abstractNumId w:val="10"/>
@@ -8081,34 +9034,34 @@
     <w:abstractNumId w:val="1"/>
   </w:num>
   <w:num w:numId="32" w16cid:durableId="1885747096">
-    <w:abstractNumId w:val="38"/>
+    <w:abstractNumId w:val="42"/>
   </w:num>
   <w:num w:numId="33" w16cid:durableId="914243845">
-    <w:abstractNumId w:val="39"/>
+    <w:abstractNumId w:val="43"/>
   </w:num>
   <w:num w:numId="34" w16cid:durableId="117770706">
-    <w:abstractNumId w:val="37"/>
+    <w:abstractNumId w:val="41"/>
   </w:num>
   <w:num w:numId="35" w16cid:durableId="2079091889">
-    <w:abstractNumId w:val="36"/>
+    <w:abstractNumId w:val="40"/>
   </w:num>
   <w:num w:numId="36" w16cid:durableId="1472748363">
     <w:abstractNumId w:val="14"/>
   </w:num>
   <w:num w:numId="37" w16cid:durableId="16009770">
-    <w:abstractNumId w:val="42"/>
+    <w:abstractNumId w:val="46"/>
   </w:num>
   <w:num w:numId="38" w16cid:durableId="227497303">
     <w:abstractNumId w:val="18"/>
   </w:num>
   <w:num w:numId="39" w16cid:durableId="1836072994">
-    <w:abstractNumId w:val="29"/>
+    <w:abstractNumId w:val="30"/>
   </w:num>
   <w:num w:numId="40" w16cid:durableId="912277900">
     <w:abstractNumId w:val="11"/>
   </w:num>
   <w:num w:numId="41" w16cid:durableId="796264559">
-    <w:abstractNumId w:val="34"/>
+    <w:abstractNumId w:val="36"/>
   </w:num>
   <w:num w:numId="42" w16cid:durableId="24642909">
     <w:abstractNumId w:val="13"/>
@@ -8118,6 +9071,18 @@
   </w:num>
   <w:num w:numId="44" w16cid:durableId="2004315047">
     <w:abstractNumId w:val="17"/>
+  </w:num>
+  <w:num w:numId="45" w16cid:durableId="864951930">
+    <w:abstractNumId w:val="38"/>
+  </w:num>
+  <w:num w:numId="46" w16cid:durableId="2078285006">
+    <w:abstractNumId w:val="27"/>
+  </w:num>
+  <w:num w:numId="47" w16cid:durableId="499320690">
+    <w:abstractNumId w:val="37"/>
+  </w:num>
+  <w:num w:numId="48" w16cid:durableId="1693797659">
+    <w:abstractNumId w:val="34"/>
   </w:num>
 </w:numbering>
 </file>
@@ -9366,4 +10331,16 @@
     </a:ext>
   </a:extLst>
 </a:theme>
+</file>
+
+<file path=customXml/item1.xml><?xml version="1.0" encoding="utf-8"?>
+<b:Sources xmlns:b="http://schemas.openxmlformats.org/officeDocument/2006/bibliography" xmlns="http://schemas.openxmlformats.org/officeDocument/2006/bibliography" SelectedStyle="\APASixthEditionOfficeOnline.xsl" StyleName="APA" Version="6"/>
+</file>
+
+<file path=customXml/itemProps1.xml><?xml version="1.0" encoding="utf-8"?>
+<ds:datastoreItem xmlns:ds="http://schemas.openxmlformats.org/officeDocument/2006/customXml" ds:itemID="{AE30219E-E24B-4155-AAF3-DCC2E6C3B2FE}">
+  <ds:schemaRefs>
+    <ds:schemaRef ds:uri="http://schemas.openxmlformats.org/officeDocument/2006/bibliography"/>
+  </ds:schemaRefs>
+</ds:datastoreItem>
 </file>
</xml_diff>